<commit_message>
Fix widget snippet rendering as http:// behind Railway's TLS-terminating proxy
</commit_message>
<xml_diff>
--- a/docs/sales/flywheel-sales-strategy-50k-6mo.docx
+++ b/docs/sales/flywheel-sales-strategy-50k-6mo.docx
@@ -104,6 +104,34 @@
           <w:szCs w:val="22"/>
         </w:rPr>
         <w:t xml:space="preserve">Если считать «в лоб» — только тариф Starter ($199/мес), только юридическая ниша, только текущий канал (founder-led outbound) — то $50K MRR означает 251 платящего клиента за 6 месяцев силами одного человека. Это нереалистично. Реальный путь к цели требует смешать тарифы и ниши/гео вместо ставки на одну $199-нишу (раздел 2) и добавить платные и партнёрские каналы поверх outbound начиная с 3-го месяца (раздел 5), поверх полностью закрытой Фазы 0.</w:t>
+      </w:r>
+    </w:p>
+    <w:p>
+      <w:pPr>
+        <w:spacing w:after="160" w:line="300"/>
+      </w:pPr>
+      <w:r>
+        <w:rPr>
+          <w:rFonts w:ascii="Calibri" w:cs="Calibri" w:eastAsia="Calibri" w:hAnsi="Calibri"/>
+          <w:b/>
+          <w:bCs/>
+          <w:sz w:val="22"/>
+          <w:szCs w:val="22"/>
+        </w:rPr>
+        <w:t xml:space="preserve">Принятое решение (гибридный путь): старт консервативный.</w:t>
+      </w:r>
+    </w:p>
+    <w:p>
+      <w:pPr>
+        <w:spacing w:after="160" w:line="300"/>
+      </w:pPr>
+      <w:r>
+        <w:rPr>
+          <w:rFonts w:ascii="Calibri" w:cs="Calibri" w:eastAsia="Calibri" w:hAnsi="Calibri"/>
+          <w:sz w:val="22"/>
+          <w:szCs w:val="22"/>
+        </w:rPr>
+        <w:t xml:space="preserve">Наём SDR/BDR и рекламный бюджет — не предопределены календарём («к мес. 2–3» из версии 1), а включаются по факту метрик первых 1–2 месяцев после запуска. Первый месяц-два движемся только на личном outbound-канале, без найма и без платного бюджета; решение об агрессивном масштабировании принимается на конкретной точке — критерии в разделе 8, подраздел «Точка принятия решения».</w:t>
       </w:r>
     </w:p>
     <w:p>
@@ -1798,7 +1826,7 @@
           <w:sz w:val="24"/>
           <w:szCs w:val="24"/>
         </w:rPr>
-        <w:t xml:space="preserve">Месяцы 2–3: расширение throughput</w:t>
+        <w:t xml:space="preserve">С точки принятия решения (конец мес. 2, если критерии выполнены): расширение throughput</w:t>
       </w:r>
     </w:p>
     <w:p>
@@ -1816,7 +1844,7 @@
           <w:sz w:val="22"/>
           <w:szCs w:val="22"/>
         </w:rPr>
-        <w:t xml:space="preserve">Найм SDR/BDR — единственный способ поднять объём outbound с 50 до 150–200 аккаунтов в неделю без потери качества персонализации. Ключевое предположение агрессивного сценария: без найма throughput остаётся потолком одного человека.</w:t>
+        <w:t xml:space="preserve">Найм SDR/BDR — единственный способ поднять объём outbound с 50 до 150–200 аккаунтов в неделю без потери качества персонализации. Не предзаданное действие «мес. 2–3» — решение принимается по метрикам (раздел 8) и финансируется только если они выполнены. Без найма throughput остаётся потолком одного человека, и это осознанный выбор гибридного пути, а не провал плана.</w:t>
       </w:r>
     </w:p>
     <w:p>
@@ -2781,7 +2809,20 @@
           <w:sz w:val="30"/>
           <w:szCs w:val="30"/>
         </w:rPr>
-        <w:t xml:space="preserve">8. Помесячный план (отсчёт — от завершения Фазы 0)</w:t>
+        <w:t xml:space="preserve">8. Помесячный план — гибридный сценарий</w:t>
+      </w:r>
+    </w:p>
+    <w:p>
+      <w:pPr>
+        <w:spacing w:after="160" w:line="300"/>
+      </w:pPr>
+      <w:r>
+        <w:rPr>
+          <w:rFonts w:ascii="Calibri" w:cs="Calibri" w:eastAsia="Calibri" w:hAnsi="Calibri"/>
+          <w:sz w:val="22"/>
+          <w:szCs w:val="22"/>
+        </w:rPr>
+        <w:t xml:space="preserve">Месяцы 1–2 после Фазы 0 фиксированы и одинаковы для обеих веток: только личный founder-led outbound, без найма и без рекламного бюджета. Дальше план расходится на два пути в зависимости от того, выполнены ли критерии перехода к агрессивному сценарию (см. ниже).</w:t>
       </w:r>
     </w:p>
     <w:tbl>
@@ -3222,565 +3263,7 @@
                 <w:sz w:val="20"/>
                 <w:szCs w:val="20"/>
               </w:rPr>
-              <w:t xml:space="preserve">Первые кейсы, найм SDR запущен</w:t>
-            </w:r>
-          </w:p>
-        </w:tc>
-      </w:tr>
-      <w:tr>
-        <w:tc>
-          <w:tcPr>
-            <w:tcW w:type="dxa" w:w="1000"/>
-            <w:tcMar>
-              <w:top w:type="dxa" w:w="80"/>
-              <w:left w:type="dxa" w:w="100"/>
-              <w:bottom w:type="dxa" w:w="80"/>
-              <w:right w:type="dxa" w:w="100"/>
-            </w:tcMar>
-          </w:tcPr>
-          <w:p>
-            <w:pPr>
-              <w:jc w:val="left"/>
-            </w:pPr>
-            <w:r>
-              <w:rPr>
-                <w:rFonts w:ascii="Calibri" w:cs="Calibri" w:eastAsia="Calibri" w:hAnsi="Calibri"/>
-                <w:b w:val="false"/>
-                <w:bCs w:val="false"/>
-                <w:color w:val="000000"/>
-                <w:sz w:val="20"/>
-                <w:szCs w:val="20"/>
-              </w:rPr>
-              <w:t xml:space="preserve">3</w:t>
-            </w:r>
-          </w:p>
-        </w:tc>
-        <w:tc>
-          <w:tcPr>
-            <w:tcW w:type="dxa" w:w="2000"/>
-            <w:tcMar>
-              <w:top w:type="dxa" w:w="80"/>
-              <w:left w:type="dxa" w:w="100"/>
-              <w:bottom w:type="dxa" w:w="80"/>
-              <w:right w:type="dxa" w:w="100"/>
-            </w:tcMar>
-          </w:tcPr>
-          <w:p>
-            <w:pPr>
-              <w:jc w:val="left"/>
-            </w:pPr>
-            <w:r>
-              <w:rPr>
-                <w:rFonts w:ascii="Calibri" w:cs="Calibri" w:eastAsia="Calibri" w:hAnsi="Calibri"/>
-                <w:b w:val="false"/>
-                <w:bCs w:val="false"/>
-                <w:color w:val="000000"/>
-                <w:sz w:val="20"/>
-                <w:szCs w:val="20"/>
-              </w:rPr>
-              <w:t xml:space="preserve">20</w:t>
-            </w:r>
-          </w:p>
-        </w:tc>
-        <w:tc>
-          <w:tcPr>
-            <w:tcW w:type="dxa" w:w="1900"/>
-            <w:tcMar>
-              <w:top w:type="dxa" w:w="80"/>
-              <w:left w:type="dxa" w:w="100"/>
-              <w:bottom w:type="dxa" w:w="80"/>
-              <w:right w:type="dxa" w:w="100"/>
-            </w:tcMar>
-          </w:tcPr>
-          <w:p>
-            <w:pPr>
-              <w:jc w:val="left"/>
-            </w:pPr>
-            <w:r>
-              <w:rPr>
-                <w:rFonts w:ascii="Calibri" w:cs="Calibri" w:eastAsia="Calibri" w:hAnsi="Calibri"/>
-                <w:b w:val="false"/>
-                <w:bCs w:val="false"/>
-                <w:color w:val="000000"/>
-                <w:sz w:val="20"/>
-                <w:szCs w:val="20"/>
-              </w:rPr>
-              <w:t xml:space="preserve">35</w:t>
-            </w:r>
-          </w:p>
-        </w:tc>
-        <w:tc>
-          <w:tcPr>
-            <w:tcW w:type="dxa" w:w="1700"/>
-            <w:tcMar>
-              <w:top w:type="dxa" w:w="80"/>
-              <w:left w:type="dxa" w:w="100"/>
-              <w:bottom w:type="dxa" w:w="80"/>
-              <w:right w:type="dxa" w:w="100"/>
-            </w:tcMar>
-          </w:tcPr>
-          <w:p>
-            <w:pPr>
-              <w:jc w:val="left"/>
-            </w:pPr>
-            <w:r>
-              <w:rPr>
-                <w:rFonts w:ascii="Calibri" w:cs="Calibri" w:eastAsia="Calibri" w:hAnsi="Calibri"/>
-                <w:b w:val="false"/>
-                <w:bCs w:val="false"/>
-                <w:color w:val="000000"/>
-                <w:sz w:val="20"/>
-                <w:szCs w:val="20"/>
-              </w:rPr>
-              <w:t xml:space="preserve">~$8,000</w:t>
-            </w:r>
-          </w:p>
-        </w:tc>
-        <w:tc>
-          <w:tcPr>
-            <w:tcW w:type="dxa" w:w="3300"/>
-            <w:tcMar>
-              <w:top w:type="dxa" w:w="80"/>
-              <w:left w:type="dxa" w:w="100"/>
-              <w:bottom w:type="dxa" w:w="80"/>
-              <w:right w:type="dxa" w:w="100"/>
-            </w:tcMar>
-          </w:tcPr>
-          <w:p>
-            <w:pPr>
-              <w:jc w:val="left"/>
-            </w:pPr>
-            <w:r>
-              <w:rPr>
-                <w:rFonts w:ascii="Calibri" w:cs="Calibri" w:eastAsia="Calibri" w:hAnsi="Calibri"/>
-                <w:b w:val="false"/>
-                <w:bCs w:val="false"/>
-                <w:color w:val="000000"/>
-                <w:sz w:val="20"/>
-                <w:szCs w:val="20"/>
-              </w:rPr>
-              <w:t xml:space="preserve">Pro-тариф, Clio marketplace, AU/UK старт</w:t>
-            </w:r>
-          </w:p>
-        </w:tc>
-      </w:tr>
-      <w:tr>
-        <w:tc>
-          <w:tcPr>
-            <w:tcW w:type="dxa" w:w="1000"/>
-            <w:shd w:fill="F2EFE9" w:val="clear"/>
-            <w:tcMar>
-              <w:top w:type="dxa" w:w="80"/>
-              <w:left w:type="dxa" w:w="100"/>
-              <w:bottom w:type="dxa" w:w="80"/>
-              <w:right w:type="dxa" w:w="100"/>
-            </w:tcMar>
-          </w:tcPr>
-          <w:p>
-            <w:pPr>
-              <w:jc w:val="left"/>
-            </w:pPr>
-            <w:r>
-              <w:rPr>
-                <w:rFonts w:ascii="Calibri" w:cs="Calibri" w:eastAsia="Calibri" w:hAnsi="Calibri"/>
-                <w:b w:val="false"/>
-                <w:bCs w:val="false"/>
-                <w:color w:val="000000"/>
-                <w:sz w:val="20"/>
-                <w:szCs w:val="20"/>
-              </w:rPr>
-              <w:t xml:space="preserve">4</w:t>
-            </w:r>
-          </w:p>
-        </w:tc>
-        <w:tc>
-          <w:tcPr>
-            <w:tcW w:type="dxa" w:w="2000"/>
-            <w:shd w:fill="F2EFE9" w:val="clear"/>
-            <w:tcMar>
-              <w:top w:type="dxa" w:w="80"/>
-              <w:left w:type="dxa" w:w="100"/>
-              <w:bottom w:type="dxa" w:w="80"/>
-              <w:right w:type="dxa" w:w="100"/>
-            </w:tcMar>
-          </w:tcPr>
-          <w:p>
-            <w:pPr>
-              <w:jc w:val="left"/>
-            </w:pPr>
-            <w:r>
-              <w:rPr>
-                <w:rFonts w:ascii="Calibri" w:cs="Calibri" w:eastAsia="Calibri" w:hAnsi="Calibri"/>
-                <w:b w:val="false"/>
-                <w:bCs w:val="false"/>
-                <w:color w:val="000000"/>
-                <w:sz w:val="20"/>
-                <w:szCs w:val="20"/>
-              </w:rPr>
-              <w:t xml:space="preserve">35</w:t>
-            </w:r>
-          </w:p>
-        </w:tc>
-        <w:tc>
-          <w:tcPr>
-            <w:tcW w:type="dxa" w:w="1900"/>
-            <w:shd w:fill="F2EFE9" w:val="clear"/>
-            <w:tcMar>
-              <w:top w:type="dxa" w:w="80"/>
-              <w:left w:type="dxa" w:w="100"/>
-              <w:bottom w:type="dxa" w:w="80"/>
-              <w:right w:type="dxa" w:w="100"/>
-            </w:tcMar>
-          </w:tcPr>
-          <w:p>
-            <w:pPr>
-              <w:jc w:val="left"/>
-            </w:pPr>
-            <w:r>
-              <w:rPr>
-                <w:rFonts w:ascii="Calibri" w:cs="Calibri" w:eastAsia="Calibri" w:hAnsi="Calibri"/>
-                <w:b w:val="false"/>
-                <w:bCs w:val="false"/>
-                <w:color w:val="000000"/>
-                <w:sz w:val="20"/>
-                <w:szCs w:val="20"/>
-              </w:rPr>
-              <w:t xml:space="preserve">70</w:t>
-            </w:r>
-          </w:p>
-        </w:tc>
-        <w:tc>
-          <w:tcPr>
-            <w:tcW w:type="dxa" w:w="1700"/>
-            <w:shd w:fill="F2EFE9" w:val="clear"/>
-            <w:tcMar>
-              <w:top w:type="dxa" w:w="80"/>
-              <w:left w:type="dxa" w:w="100"/>
-              <w:bottom w:type="dxa" w:w="80"/>
-              <w:right w:type="dxa" w:w="100"/>
-            </w:tcMar>
-          </w:tcPr>
-          <w:p>
-            <w:pPr>
-              <w:jc w:val="left"/>
-            </w:pPr>
-            <w:r>
-              <w:rPr>
-                <w:rFonts w:ascii="Calibri" w:cs="Calibri" w:eastAsia="Calibri" w:hAnsi="Calibri"/>
-                <w:b w:val="false"/>
-                <w:bCs w:val="false"/>
-                <w:color w:val="000000"/>
-                <w:sz w:val="20"/>
-                <w:szCs w:val="20"/>
-              </w:rPr>
-              <w:t xml:space="preserve">~$18,000</w:t>
-            </w:r>
-          </w:p>
-        </w:tc>
-        <w:tc>
-          <w:tcPr>
-            <w:tcW w:type="dxa" w:w="3300"/>
-            <w:shd w:fill="F2EFE9" w:val="clear"/>
-            <w:tcMar>
-              <w:top w:type="dxa" w:w="80"/>
-              <w:left w:type="dxa" w:w="100"/>
-              <w:bottom w:type="dxa" w:w="80"/>
-              <w:right w:type="dxa" w:w="100"/>
-            </w:tcMar>
-          </w:tcPr>
-          <w:p>
-            <w:pPr>
-              <w:jc w:val="left"/>
-            </w:pPr>
-            <w:r>
-              <w:rPr>
-                <w:rFonts w:ascii="Calibri" w:cs="Calibri" w:eastAsia="Calibri" w:hAnsi="Calibri"/>
-                <w:b w:val="false"/>
-                <w:bCs w:val="false"/>
-                <w:color w:val="000000"/>
-                <w:sz w:val="20"/>
-                <w:szCs w:val="20"/>
-              </w:rPr>
-              <w:t xml:space="preserve">Волна 2, платные каналы (на готовых креативах), реферальная программа</w:t>
-            </w:r>
-          </w:p>
-        </w:tc>
-      </w:tr>
-      <w:tr>
-        <w:tc>
-          <w:tcPr>
-            <w:tcW w:type="dxa" w:w="1000"/>
-            <w:tcMar>
-              <w:top w:type="dxa" w:w="80"/>
-              <w:left w:type="dxa" w:w="100"/>
-              <w:bottom w:type="dxa" w:w="80"/>
-              <w:right w:type="dxa" w:w="100"/>
-            </w:tcMar>
-          </w:tcPr>
-          <w:p>
-            <w:pPr>
-              <w:jc w:val="left"/>
-            </w:pPr>
-            <w:r>
-              <w:rPr>
-                <w:rFonts w:ascii="Calibri" w:cs="Calibri" w:eastAsia="Calibri" w:hAnsi="Calibri"/>
-                <w:b w:val="false"/>
-                <w:bCs w:val="false"/>
-                <w:color w:val="000000"/>
-                <w:sz w:val="20"/>
-                <w:szCs w:val="20"/>
-              </w:rPr>
-              <w:t xml:space="preserve">5</w:t>
-            </w:r>
-          </w:p>
-        </w:tc>
-        <w:tc>
-          <w:tcPr>
-            <w:tcW w:type="dxa" w:w="2000"/>
-            <w:tcMar>
-              <w:top w:type="dxa" w:w="80"/>
-              <w:left w:type="dxa" w:w="100"/>
-              <w:bottom w:type="dxa" w:w="80"/>
-              <w:right w:type="dxa" w:w="100"/>
-            </w:tcMar>
-          </w:tcPr>
-          <w:p>
-            <w:pPr>
-              <w:jc w:val="left"/>
-            </w:pPr>
-            <w:r>
-              <w:rPr>
-                <w:rFonts w:ascii="Calibri" w:cs="Calibri" w:eastAsia="Calibri" w:hAnsi="Calibri"/>
-                <w:b w:val="false"/>
-                <w:bCs w:val="false"/>
-                <w:color w:val="000000"/>
-                <w:sz w:val="20"/>
-                <w:szCs w:val="20"/>
-              </w:rPr>
-              <w:t xml:space="preserve">60</w:t>
-            </w:r>
-          </w:p>
-        </w:tc>
-        <w:tc>
-          <w:tcPr>
-            <w:tcW w:type="dxa" w:w="1900"/>
-            <w:tcMar>
-              <w:top w:type="dxa" w:w="80"/>
-              <w:left w:type="dxa" w:w="100"/>
-              <w:bottom w:type="dxa" w:w="80"/>
-              <w:right w:type="dxa" w:w="100"/>
-            </w:tcMar>
-          </w:tcPr>
-          <w:p>
-            <w:pPr>
-              <w:jc w:val="left"/>
-            </w:pPr>
-            <w:r>
-              <w:rPr>
-                <w:rFonts w:ascii="Calibri" w:cs="Calibri" w:eastAsia="Calibri" w:hAnsi="Calibri"/>
-                <w:b w:val="false"/>
-                <w:bCs w:val="false"/>
-                <w:color w:val="000000"/>
-                <w:sz w:val="20"/>
-                <w:szCs w:val="20"/>
-              </w:rPr>
-              <w:t xml:space="preserve">130</w:t>
-            </w:r>
-          </w:p>
-        </w:tc>
-        <w:tc>
-          <w:tcPr>
-            <w:tcW w:type="dxa" w:w="1700"/>
-            <w:tcMar>
-              <w:top w:type="dxa" w:w="80"/>
-              <w:left w:type="dxa" w:w="100"/>
-              <w:bottom w:type="dxa" w:w="80"/>
-              <w:right w:type="dxa" w:w="100"/>
-            </w:tcMar>
-          </w:tcPr>
-          <w:p>
-            <w:pPr>
-              <w:jc w:val="left"/>
-            </w:pPr>
-            <w:r>
-              <w:rPr>
-                <w:rFonts w:ascii="Calibri" w:cs="Calibri" w:eastAsia="Calibri" w:hAnsi="Calibri"/>
-                <w:b w:val="false"/>
-                <w:bCs w:val="false"/>
-                <w:color w:val="000000"/>
-                <w:sz w:val="20"/>
-                <w:szCs w:val="20"/>
-              </w:rPr>
-              <w:t xml:space="preserve">~$36,000</w:t>
-            </w:r>
-          </w:p>
-        </w:tc>
-        <w:tc>
-          <w:tcPr>
-            <w:tcW w:type="dxa" w:w="3300"/>
-            <w:tcMar>
-              <w:top w:type="dxa" w:w="80"/>
-              <w:left w:type="dxa" w:w="100"/>
-              <w:bottom w:type="dxa" w:w="80"/>
-              <w:right w:type="dxa" w:w="100"/>
-            </w:tcMar>
-          </w:tcPr>
-          <w:p>
-            <w:pPr>
-              <w:jc w:val="left"/>
-            </w:pPr>
-            <w:r>
-              <w:rPr>
-                <w:rFonts w:ascii="Calibri" w:cs="Calibri" w:eastAsia="Calibri" w:hAnsi="Calibri"/>
-                <w:b w:val="false"/>
-                <w:bCs w:val="false"/>
-                <w:color w:val="000000"/>
-                <w:sz w:val="20"/>
-                <w:szCs w:val="20"/>
-              </w:rPr>
-              <w:t xml:space="preserve">Compounding рефералов и партнёрств</w:t>
-            </w:r>
-          </w:p>
-        </w:tc>
-      </w:tr>
-      <w:tr>
-        <w:tc>
-          <w:tcPr>
-            <w:tcW w:type="dxa" w:w="1000"/>
-            <w:shd w:fill="F2EFE9" w:val="clear"/>
-            <w:tcMar>
-              <w:top w:type="dxa" w:w="80"/>
-              <w:left w:type="dxa" w:w="100"/>
-              <w:bottom w:type="dxa" w:w="80"/>
-              <w:right w:type="dxa" w:w="100"/>
-            </w:tcMar>
-          </w:tcPr>
-          <w:p>
-            <w:pPr>
-              <w:jc w:val="left"/>
-            </w:pPr>
-            <w:r>
-              <w:rPr>
-                <w:rFonts w:ascii="Calibri" w:cs="Calibri" w:eastAsia="Calibri" w:hAnsi="Calibri"/>
-                <w:b w:val="false"/>
-                <w:bCs w:val="false"/>
-                <w:color w:val="000000"/>
-                <w:sz w:val="20"/>
-                <w:szCs w:val="20"/>
-              </w:rPr>
-              <w:t xml:space="preserve">6</w:t>
-            </w:r>
-          </w:p>
-        </w:tc>
-        <w:tc>
-          <w:tcPr>
-            <w:tcW w:type="dxa" w:w="2000"/>
-            <w:shd w:fill="F2EFE9" w:val="clear"/>
-            <w:tcMar>
-              <w:top w:type="dxa" w:w="80"/>
-              <w:left w:type="dxa" w:w="100"/>
-              <w:bottom w:type="dxa" w:w="80"/>
-              <w:right w:type="dxa" w:w="100"/>
-            </w:tcMar>
-          </w:tcPr>
-          <w:p>
-            <w:pPr>
-              <w:jc w:val="left"/>
-            </w:pPr>
-            <w:r>
-              <w:rPr>
-                <w:rFonts w:ascii="Calibri" w:cs="Calibri" w:eastAsia="Calibri" w:hAnsi="Calibri"/>
-                <w:b w:val="false"/>
-                <w:bCs w:val="false"/>
-                <w:color w:val="000000"/>
-                <w:sz w:val="20"/>
-                <w:szCs w:val="20"/>
-              </w:rPr>
-              <w:t xml:space="preserve">60</w:t>
-            </w:r>
-          </w:p>
-        </w:tc>
-        <w:tc>
-          <w:tcPr>
-            <w:tcW w:type="dxa" w:w="1900"/>
-            <w:shd w:fill="F2EFE9" w:val="clear"/>
-            <w:tcMar>
-              <w:top w:type="dxa" w:w="80"/>
-              <w:left w:type="dxa" w:w="100"/>
-              <w:bottom w:type="dxa" w:w="80"/>
-              <w:right w:type="dxa" w:w="100"/>
-            </w:tcMar>
-          </w:tcPr>
-          <w:p>
-            <w:pPr>
-              <w:jc w:val="left"/>
-            </w:pPr>
-            <w:r>
-              <w:rPr>
-                <w:rFonts w:ascii="Calibri" w:cs="Calibri" w:eastAsia="Calibri" w:hAnsi="Calibri"/>
-                <w:b w:val="false"/>
-                <w:bCs w:val="false"/>
-                <w:color w:val="000000"/>
-                <w:sz w:val="20"/>
-                <w:szCs w:val="20"/>
-              </w:rPr>
-              <w:t xml:space="preserve">190</w:t>
-            </w:r>
-          </w:p>
-        </w:tc>
-        <w:tc>
-          <w:tcPr>
-            <w:tcW w:type="dxa" w:w="1700"/>
-            <w:shd w:fill="F2EFE9" w:val="clear"/>
-            <w:tcMar>
-              <w:top w:type="dxa" w:w="80"/>
-              <w:left w:type="dxa" w:w="100"/>
-              <w:bottom w:type="dxa" w:w="80"/>
-              <w:right w:type="dxa" w:w="100"/>
-            </w:tcMar>
-          </w:tcPr>
-          <w:p>
-            <w:pPr>
-              <w:jc w:val="left"/>
-            </w:pPr>
-            <w:r>
-              <w:rPr>
-                <w:rFonts w:ascii="Calibri" w:cs="Calibri" w:eastAsia="Calibri" w:hAnsi="Calibri"/>
-                <w:b w:val="false"/>
-                <w:bCs w:val="false"/>
-                <w:color w:val="000000"/>
-                <w:sz w:val="20"/>
-                <w:szCs w:val="20"/>
-              </w:rPr>
-              <w:t xml:space="preserve">~$50,000</w:t>
-            </w:r>
-          </w:p>
-        </w:tc>
-        <w:tc>
-          <w:tcPr>
-            <w:tcW w:type="dxa" w:w="3300"/>
-            <w:shd w:fill="F2EFE9" w:val="clear"/>
-            <w:tcMar>
-              <w:top w:type="dxa" w:w="80"/>
-              <w:left w:type="dxa" w:w="100"/>
-              <w:bottom w:type="dxa" w:w="80"/>
-              <w:right w:type="dxa" w:w="100"/>
-            </w:tcMar>
-          </w:tcPr>
-          <w:p>
-            <w:pPr>
-              <w:jc w:val="left"/>
-            </w:pPr>
-            <w:r>
-              <w:rPr>
-                <w:rFonts w:ascii="Calibri" w:cs="Calibri" w:eastAsia="Calibri" w:hAnsi="Calibri"/>
-                <w:b w:val="false"/>
-                <w:bCs w:val="false"/>
-                <w:color w:val="000000"/>
-                <w:sz w:val="20"/>
-                <w:szCs w:val="20"/>
-              </w:rPr>
-              <w:t xml:space="preserve">Целевая конфигурация раздела 2 достигнута</w:t>
+              <w:t xml:space="preserve">Первые кейсы, метрики собираются к точке решения</w:t>
             </w:r>
           </w:p>
         </w:tc>
@@ -3799,7 +3282,1924 @@
           <w:sz w:val="20"/>
           <w:szCs w:val="20"/>
         </w:rPr>
-        <w:t xml:space="preserve">Ориентир мес. 2 (~$3K MRR, 15 клиентов) совпадает с уже существующей внутренней рекомендацией «10–20 пилотов ко 2-му месяцу» — это не новая цифра, а точка сверки, что план идёт по плану. Рост мес. 3→6 предполагает, что найм и платные каналы запущены вовремя — это не гарантированный, а целевой темп.</w:t>
+        <w:t xml:space="preserve">Ориентир мес. 2 (~$3K MRR, 15 клиентов) совпадает с уже существующей внутренней рекомендацией «10–20 пилотов ко 2-му месяцу».</w:t>
+      </w:r>
+    </w:p>
+    <w:p>
+      <w:pPr>
+        <w:pStyle w:val="Heading2"/>
+        <w:spacing w:after="150" w:before="300"/>
+      </w:pPr>
+      <w:r>
+        <w:rPr>
+          <w:rFonts w:ascii="Calibri" w:cs="Calibri" w:eastAsia="Calibri" w:hAnsi="Calibri"/>
+          <w:b/>
+          <w:bCs/>
+          <w:color w:val="1F3A5F"/>
+          <w:sz w:val="24"/>
+          <w:szCs w:val="24"/>
+        </w:rPr>
+        <w:t xml:space="preserve">Точка принятия решения — конец месяца 2</w:t>
+      </w:r>
+    </w:p>
+    <w:p>
+      <w:pPr>
+        <w:spacing w:after="160" w:line="300"/>
+      </w:pPr>
+      <w:r>
+        <w:rPr>
+          <w:rFonts w:ascii="Calibri" w:cs="Calibri" w:eastAsia="Calibri" w:hAnsi="Calibri"/>
+          <w:sz w:val="22"/>
+          <w:szCs w:val="22"/>
+        </w:rPr>
+        <w:t xml:space="preserve">По итогам первых двух месяцев на личном outbound-канале — явное решение, финансировать ли найм SDR/BDR и рекламный бюджет с месяца 3, а не автоматический переход по календарю.</w:t>
+      </w:r>
+    </w:p>
+    <w:tbl>
+      <w:tblPr>
+        <w:tblW w:type="dxa" w:w="9000"/>
+        <w:tblBorders>
+          <w:top w:val="single" w:color="CCCCCC" w:sz="4"/>
+          <w:left w:val="single" w:color="CCCCCC" w:sz="4"/>
+          <w:bottom w:val="single" w:color="CCCCCC" w:sz="4"/>
+          <w:right w:val="single" w:color="CCCCCC" w:sz="4"/>
+          <w:insideH w:val="single" w:color="E0E0E0" w:sz="4"/>
+          <w:insideV w:val="single" w:color="E0E0E0" w:sz="4"/>
+        </w:tblBorders>
+      </w:tblPr>
+      <w:tblGrid>
+        <w:gridCol w:w="4400"/>
+        <w:gridCol w:w="4600"/>
+      </w:tblGrid>
+      <w:tr>
+        <w:trPr>
+          <w:tblHeader/>
+        </w:trPr>
+        <w:tc>
+          <w:tcPr>
+            <w:tcW w:type="dxa" w:w="4400"/>
+            <w:shd w:fill="1F3A5F" w:val="clear"/>
+            <w:tcMar>
+              <w:top w:type="dxa" w:w="80"/>
+              <w:left w:type="dxa" w:w="100"/>
+              <w:bottom w:type="dxa" w:w="80"/>
+              <w:right w:type="dxa" w:w="100"/>
+            </w:tcMar>
+          </w:tcPr>
+          <w:p>
+            <w:pPr>
+              <w:jc w:val="left"/>
+            </w:pPr>
+            <w:r>
+              <w:rPr>
+                <w:rFonts w:ascii="Calibri" w:cs="Calibri" w:eastAsia="Calibri" w:hAnsi="Calibri"/>
+                <w:b/>
+                <w:bCs/>
+                <w:color w:val="FFFFFF"/>
+                <w:sz w:val="20"/>
+                <w:szCs w:val="20"/>
+              </w:rPr>
+              <w:t xml:space="preserve">Критерий</w:t>
+            </w:r>
+          </w:p>
+        </w:tc>
+        <w:tc>
+          <w:tcPr>
+            <w:tcW w:type="dxa" w:w="4600"/>
+            <w:shd w:fill="1F3A5F" w:val="clear"/>
+            <w:tcMar>
+              <w:top w:type="dxa" w:w="80"/>
+              <w:left w:type="dxa" w:w="100"/>
+              <w:bottom w:type="dxa" w:w="80"/>
+              <w:right w:type="dxa" w:w="100"/>
+            </w:tcMar>
+          </w:tcPr>
+          <w:p>
+            <w:pPr>
+              <w:jc w:val="left"/>
+            </w:pPr>
+            <w:r>
+              <w:rPr>
+                <w:rFonts w:ascii="Calibri" w:cs="Calibri" w:eastAsia="Calibri" w:hAnsi="Calibri"/>
+                <w:b/>
+                <w:bCs/>
+                <w:color w:val="FFFFFF"/>
+                <w:sz w:val="20"/>
+                <w:szCs w:val="20"/>
+              </w:rPr>
+              <w:t xml:space="preserve">Порог для перехода к агрессивному сценарию</w:t>
+            </w:r>
+          </w:p>
+        </w:tc>
+      </w:tr>
+      <w:tr>
+        <w:tc>
+          <w:tcPr>
+            <w:tcW w:type="dxa" w:w="4400"/>
+            <w:tcMar>
+              <w:top w:type="dxa" w:w="80"/>
+              <w:left w:type="dxa" w:w="100"/>
+              <w:bottom w:type="dxa" w:w="80"/>
+              <w:right w:type="dxa" w:w="100"/>
+            </w:tcMar>
+          </w:tcPr>
+          <w:p>
+            <w:pPr>
+              <w:jc w:val="left"/>
+            </w:pPr>
+            <w:r>
+              <w:rPr>
+                <w:rFonts w:ascii="Calibri" w:cs="Calibri" w:eastAsia="Calibri" w:hAnsi="Calibri"/>
+                <w:b w:val="false"/>
+                <w:bCs w:val="false"/>
+                <w:color w:val="000000"/>
+                <w:sz w:val="20"/>
+                <w:szCs w:val="20"/>
+              </w:rPr>
+              <w:t xml:space="preserve">Конверсия триал → оплата</w:t>
+            </w:r>
+          </w:p>
+        </w:tc>
+        <w:tc>
+          <w:tcPr>
+            <w:tcW w:type="dxa" w:w="4600"/>
+            <w:tcMar>
+              <w:top w:type="dxa" w:w="80"/>
+              <w:left w:type="dxa" w:w="100"/>
+              <w:bottom w:type="dxa" w:w="80"/>
+              <w:right w:type="dxa" w:w="100"/>
+            </w:tcMar>
+          </w:tcPr>
+          <w:p>
+            <w:pPr>
+              <w:jc w:val="left"/>
+            </w:pPr>
+            <w:r>
+              <w:rPr>
+                <w:rFonts w:ascii="Calibri" w:cs="Calibri" w:eastAsia="Calibri" w:hAnsi="Calibri"/>
+                <w:b w:val="false"/>
+                <w:bCs w:val="false"/>
+                <w:color w:val="000000"/>
+                <w:sz w:val="20"/>
+                <w:szCs w:val="20"/>
+              </w:rPr>
+              <w:t xml:space="preserve">≥ 25–30%</w:t>
+            </w:r>
+          </w:p>
+        </w:tc>
+      </w:tr>
+      <w:tr>
+        <w:tc>
+          <w:tcPr>
+            <w:tcW w:type="dxa" w:w="4400"/>
+            <w:shd w:fill="F2EFE9" w:val="clear"/>
+            <w:tcMar>
+              <w:top w:type="dxa" w:w="80"/>
+              <w:left w:type="dxa" w:w="100"/>
+              <w:bottom w:type="dxa" w:w="80"/>
+              <w:right w:type="dxa" w:w="100"/>
+            </w:tcMar>
+          </w:tcPr>
+          <w:p>
+            <w:pPr>
+              <w:jc w:val="left"/>
+            </w:pPr>
+            <w:r>
+              <w:rPr>
+                <w:rFonts w:ascii="Calibri" w:cs="Calibri" w:eastAsia="Calibri" w:hAnsi="Calibri"/>
+                <w:b w:val="false"/>
+                <w:bCs w:val="false"/>
+                <w:color w:val="000000"/>
+                <w:sz w:val="20"/>
+                <w:szCs w:val="20"/>
+              </w:rPr>
+              <w:t xml:space="preserve">Reply rate на outbound-касания</w:t>
+            </w:r>
+          </w:p>
+        </w:tc>
+        <w:tc>
+          <w:tcPr>
+            <w:tcW w:type="dxa" w:w="4600"/>
+            <w:shd w:fill="F2EFE9" w:val="clear"/>
+            <w:tcMar>
+              <w:top w:type="dxa" w:w="80"/>
+              <w:left w:type="dxa" w:w="100"/>
+              <w:bottom w:type="dxa" w:w="80"/>
+              <w:right w:type="dxa" w:w="100"/>
+            </w:tcMar>
+          </w:tcPr>
+          <w:p>
+            <w:pPr>
+              <w:jc w:val="left"/>
+            </w:pPr>
+            <w:r>
+              <w:rPr>
+                <w:rFonts w:ascii="Calibri" w:cs="Calibri" w:eastAsia="Calibri" w:hAnsi="Calibri"/>
+                <w:b w:val="false"/>
+                <w:bCs w:val="false"/>
+                <w:color w:val="000000"/>
+                <w:sz w:val="20"/>
+                <w:szCs w:val="20"/>
+              </w:rPr>
+              <w:t xml:space="preserve">≥ 8–10%</w:t>
+            </w:r>
+          </w:p>
+        </w:tc>
+      </w:tr>
+      <w:tr>
+        <w:tc>
+          <w:tcPr>
+            <w:tcW w:type="dxa" w:w="4400"/>
+            <w:tcMar>
+              <w:top w:type="dxa" w:w="80"/>
+              <w:left w:type="dxa" w:w="100"/>
+              <w:bottom w:type="dxa" w:w="80"/>
+              <w:right w:type="dxa" w:w="100"/>
+            </w:tcMar>
+          </w:tcPr>
+          <w:p>
+            <w:pPr>
+              <w:jc w:val="left"/>
+            </w:pPr>
+            <w:r>
+              <w:rPr>
+                <w:rFonts w:ascii="Calibri" w:cs="Calibri" w:eastAsia="Calibri" w:hAnsi="Calibri"/>
+                <w:b w:val="false"/>
+                <w:bCs w:val="false"/>
+                <w:color w:val="000000"/>
+                <w:sz w:val="20"/>
+                <w:szCs w:val="20"/>
+              </w:rPr>
+              <w:t xml:space="preserve">Платящих клиентов к концу мес. 2</w:t>
+            </w:r>
+          </w:p>
+        </w:tc>
+        <w:tc>
+          <w:tcPr>
+            <w:tcW w:type="dxa" w:w="4600"/>
+            <w:tcMar>
+              <w:top w:type="dxa" w:w="80"/>
+              <w:left w:type="dxa" w:w="100"/>
+              <w:bottom w:type="dxa" w:w="80"/>
+              <w:right w:type="dxa" w:w="100"/>
+            </w:tcMar>
+          </w:tcPr>
+          <w:p>
+            <w:pPr>
+              <w:jc w:val="left"/>
+            </w:pPr>
+            <w:r>
+              <w:rPr>
+                <w:rFonts w:ascii="Calibri" w:cs="Calibri" w:eastAsia="Calibri" w:hAnsi="Calibri"/>
+                <w:b w:val="false"/>
+                <w:bCs w:val="false"/>
+                <w:color w:val="000000"/>
+                <w:sz w:val="20"/>
+                <w:szCs w:val="20"/>
+              </w:rPr>
+              <w:t xml:space="preserve">≥ 10–15 (по плану)</w:t>
+            </w:r>
+          </w:p>
+        </w:tc>
+      </w:tr>
+      <w:tr>
+        <w:tc>
+          <w:tcPr>
+            <w:tcW w:type="dxa" w:w="4400"/>
+            <w:shd w:fill="F2EFE9" w:val="clear"/>
+            <w:tcMar>
+              <w:top w:type="dxa" w:w="80"/>
+              <w:left w:type="dxa" w:w="100"/>
+              <w:bottom w:type="dxa" w:w="80"/>
+              <w:right w:type="dxa" w:w="100"/>
+            </w:tcMar>
+          </w:tcPr>
+          <w:p>
+            <w:pPr>
+              <w:jc w:val="left"/>
+            </w:pPr>
+            <w:r>
+              <w:rPr>
+                <w:rFonts w:ascii="Calibri" w:cs="Calibri" w:eastAsia="Calibri" w:hAnsi="Calibri"/>
+                <w:b w:val="false"/>
+                <w:bCs w:val="false"/>
+                <w:color w:val="000000"/>
+                <w:sz w:val="20"/>
+                <w:szCs w:val="20"/>
+              </w:rPr>
+              <w:t xml:space="preserve">Ранний churn первых клиентов</w:t>
+            </w:r>
+          </w:p>
+        </w:tc>
+        <w:tc>
+          <w:tcPr>
+            <w:tcW w:type="dxa" w:w="4600"/>
+            <w:shd w:fill="F2EFE9" w:val="clear"/>
+            <w:tcMar>
+              <w:top w:type="dxa" w:w="80"/>
+              <w:left w:type="dxa" w:w="100"/>
+              <w:bottom w:type="dxa" w:w="80"/>
+              <w:right w:type="dxa" w:w="100"/>
+            </w:tcMar>
+          </w:tcPr>
+          <w:p>
+            <w:pPr>
+              <w:jc w:val="left"/>
+            </w:pPr>
+            <w:r>
+              <w:rPr>
+                <w:rFonts w:ascii="Calibri" w:cs="Calibri" w:eastAsia="Calibri" w:hAnsi="Calibri"/>
+                <w:b w:val="false"/>
+                <w:bCs w:val="false"/>
+                <w:color w:val="000000"/>
+                <w:sz w:val="20"/>
+                <w:szCs w:val="20"/>
+              </w:rPr>
+              <w:t xml:space="preserve">низкий, без явного отказа от продукта</w:t>
+            </w:r>
+          </w:p>
+        </w:tc>
+      </w:tr>
+      <w:tr>
+        <w:tc>
+          <w:tcPr>
+            <w:tcW w:type="dxa" w:w="4400"/>
+            <w:tcMar>
+              <w:top w:type="dxa" w:w="80"/>
+              <w:left w:type="dxa" w:w="100"/>
+              <w:bottom w:type="dxa" w:w="80"/>
+              <w:right w:type="dxa" w:w="100"/>
+            </w:tcMar>
+          </w:tcPr>
+          <w:p>
+            <w:pPr>
+              <w:jc w:val="left"/>
+            </w:pPr>
+            <w:r>
+              <w:rPr>
+                <w:rFonts w:ascii="Calibri" w:cs="Calibri" w:eastAsia="Calibri" w:hAnsi="Calibri"/>
+                <w:b w:val="false"/>
+                <w:bCs w:val="false"/>
+                <w:color w:val="000000"/>
+                <w:sz w:val="20"/>
+                <w:szCs w:val="20"/>
+              </w:rPr>
+              <w:t xml:space="preserve">Обратная связь design partners</w:t>
+            </w:r>
+          </w:p>
+        </w:tc>
+        <w:tc>
+          <w:tcPr>
+            <w:tcW w:type="dxa" w:w="4600"/>
+            <w:tcMar>
+              <w:top w:type="dxa" w:w="80"/>
+              <w:left w:type="dxa" w:w="100"/>
+              <w:bottom w:type="dxa" w:w="80"/>
+              <w:right w:type="dxa" w:w="100"/>
+            </w:tcMar>
+          </w:tcPr>
+          <w:p>
+            <w:pPr>
+              <w:jc w:val="left"/>
+            </w:pPr>
+            <w:r>
+              <w:rPr>
+                <w:rFonts w:ascii="Calibri" w:cs="Calibri" w:eastAsia="Calibri" w:hAnsi="Calibri"/>
+                <w:b w:val="false"/>
+                <w:bCs w:val="false"/>
+                <w:color w:val="000000"/>
+                <w:sz w:val="20"/>
+                <w:szCs w:val="20"/>
+              </w:rPr>
+              <w:t xml:space="preserve">готовы быть кейсом/референсом</w:t>
+            </w:r>
+          </w:p>
+        </w:tc>
+      </w:tr>
+    </w:tbl>
+    <w:p>
+      <w:pPr>
+        <w:spacing w:after="160" w:line="300"/>
+      </w:pPr>
+      <w:r>
+        <w:rPr>
+          <w:rFonts w:ascii="Calibri" w:cs="Calibri" w:eastAsia="Calibri" w:hAnsi="Calibri"/>
+          <w:sz w:val="22"/>
+          <w:szCs w:val="22"/>
+        </w:rPr>
+        <w:t xml:space="preserve">Если критерии выполнены — переходим к агрессивной ветке ниже. Если нет — остаёмся на консервативной ветке и пересматриваем решение повторно в конце месяца 4, не форсируя найм на неподтверждённых цифрах.</w:t>
+      </w:r>
+    </w:p>
+    <w:p>
+      <w:pPr>
+        <w:pStyle w:val="Heading2"/>
+        <w:spacing w:after="150" w:before="300"/>
+      </w:pPr>
+      <w:r>
+        <w:rPr>
+          <w:rFonts w:ascii="Calibri" w:cs="Calibri" w:eastAsia="Calibri" w:hAnsi="Calibri"/>
+          <w:b/>
+          <w:bCs/>
+          <w:color w:val="1F3A5F"/>
+          <w:sz w:val="24"/>
+          <w:szCs w:val="24"/>
+        </w:rPr>
+        <w:t xml:space="preserve">Агрессивная ветка (мес. 3–6, если критерии выполнены)</w:t>
+      </w:r>
+    </w:p>
+    <w:tbl>
+      <w:tblPr>
+        <w:tblW w:type="dxa" w:w="9900"/>
+        <w:tblBorders>
+          <w:top w:val="single" w:color="CCCCCC" w:sz="4"/>
+          <w:left w:val="single" w:color="CCCCCC" w:sz="4"/>
+          <w:bottom w:val="single" w:color="CCCCCC" w:sz="4"/>
+          <w:right w:val="single" w:color="CCCCCC" w:sz="4"/>
+          <w:insideH w:val="single" w:color="E0E0E0" w:sz="4"/>
+          <w:insideV w:val="single" w:color="E0E0E0" w:sz="4"/>
+        </w:tblBorders>
+      </w:tblPr>
+      <w:tblGrid>
+        <w:gridCol w:w="1000"/>
+        <w:gridCol w:w="2000"/>
+        <w:gridCol w:w="1900"/>
+        <w:gridCol w:w="1700"/>
+        <w:gridCol w:w="3300"/>
+      </w:tblGrid>
+      <w:tr>
+        <w:trPr>
+          <w:tblHeader/>
+        </w:trPr>
+        <w:tc>
+          <w:tcPr>
+            <w:tcW w:type="dxa" w:w="1000"/>
+            <w:shd w:fill="1F3A5F" w:val="clear"/>
+            <w:tcMar>
+              <w:top w:type="dxa" w:w="80"/>
+              <w:left w:type="dxa" w:w="100"/>
+              <w:bottom w:type="dxa" w:w="80"/>
+              <w:right w:type="dxa" w:w="100"/>
+            </w:tcMar>
+          </w:tcPr>
+          <w:p>
+            <w:pPr>
+              <w:jc w:val="left"/>
+            </w:pPr>
+            <w:r>
+              <w:rPr>
+                <w:rFonts w:ascii="Calibri" w:cs="Calibri" w:eastAsia="Calibri" w:hAnsi="Calibri"/>
+                <w:b/>
+                <w:bCs/>
+                <w:color w:val="FFFFFF"/>
+                <w:sz w:val="20"/>
+                <w:szCs w:val="20"/>
+              </w:rPr>
+              <w:t xml:space="preserve">Месяц</w:t>
+            </w:r>
+          </w:p>
+        </w:tc>
+        <w:tc>
+          <w:tcPr>
+            <w:tcW w:type="dxa" w:w="2000"/>
+            <w:shd w:fill="1F3A5F" w:val="clear"/>
+            <w:tcMar>
+              <w:top w:type="dxa" w:w="80"/>
+              <w:left w:type="dxa" w:w="100"/>
+              <w:bottom w:type="dxa" w:w="80"/>
+              <w:right w:type="dxa" w:w="100"/>
+            </w:tcMar>
+          </w:tcPr>
+          <w:p>
+            <w:pPr>
+              <w:jc w:val="left"/>
+            </w:pPr>
+            <w:r>
+              <w:rPr>
+                <w:rFonts w:ascii="Calibri" w:cs="Calibri" w:eastAsia="Calibri" w:hAnsi="Calibri"/>
+                <w:b/>
+                <w:bCs/>
+                <w:color w:val="FFFFFF"/>
+                <w:sz w:val="20"/>
+                <w:szCs w:val="20"/>
+              </w:rPr>
+              <w:t xml:space="preserve">Новых клиентов</w:t>
+            </w:r>
+          </w:p>
+        </w:tc>
+        <w:tc>
+          <w:tcPr>
+            <w:tcW w:type="dxa" w:w="1900"/>
+            <w:shd w:fill="1F3A5F" w:val="clear"/>
+            <w:tcMar>
+              <w:top w:type="dxa" w:w="80"/>
+              <w:left w:type="dxa" w:w="100"/>
+              <w:bottom w:type="dxa" w:w="80"/>
+              <w:right w:type="dxa" w:w="100"/>
+            </w:tcMar>
+          </w:tcPr>
+          <w:p>
+            <w:pPr>
+              <w:jc w:val="left"/>
+            </w:pPr>
+            <w:r>
+              <w:rPr>
+                <w:rFonts w:ascii="Calibri" w:cs="Calibri" w:eastAsia="Calibri" w:hAnsi="Calibri"/>
+                <w:b/>
+                <w:bCs/>
+                <w:color w:val="FFFFFF"/>
+                <w:sz w:val="20"/>
+                <w:szCs w:val="20"/>
+              </w:rPr>
+              <w:t xml:space="preserve">Всего клиентов</w:t>
+            </w:r>
+          </w:p>
+        </w:tc>
+        <w:tc>
+          <w:tcPr>
+            <w:tcW w:type="dxa" w:w="1700"/>
+            <w:shd w:fill="1F3A5F" w:val="clear"/>
+            <w:tcMar>
+              <w:top w:type="dxa" w:w="80"/>
+              <w:left w:type="dxa" w:w="100"/>
+              <w:bottom w:type="dxa" w:w="80"/>
+              <w:right w:type="dxa" w:w="100"/>
+            </w:tcMar>
+          </w:tcPr>
+          <w:p>
+            <w:pPr>
+              <w:jc w:val="left"/>
+            </w:pPr>
+            <w:r>
+              <w:rPr>
+                <w:rFonts w:ascii="Calibri" w:cs="Calibri" w:eastAsia="Calibri" w:hAnsi="Calibri"/>
+                <w:b/>
+                <w:bCs/>
+                <w:color w:val="FFFFFF"/>
+                <w:sz w:val="20"/>
+                <w:szCs w:val="20"/>
+              </w:rPr>
+              <w:t xml:space="preserve">MRR</w:t>
+            </w:r>
+          </w:p>
+        </w:tc>
+        <w:tc>
+          <w:tcPr>
+            <w:tcW w:type="dxa" w:w="3300"/>
+            <w:shd w:fill="1F3A5F" w:val="clear"/>
+            <w:tcMar>
+              <w:top w:type="dxa" w:w="80"/>
+              <w:left w:type="dxa" w:w="100"/>
+              <w:bottom w:type="dxa" w:w="80"/>
+              <w:right w:type="dxa" w:w="100"/>
+            </w:tcMar>
+          </w:tcPr>
+          <w:p>
+            <w:pPr>
+              <w:jc w:val="left"/>
+            </w:pPr>
+            <w:r>
+              <w:rPr>
+                <w:rFonts w:ascii="Calibri" w:cs="Calibri" w:eastAsia="Calibri" w:hAnsi="Calibri"/>
+                <w:b/>
+                <w:bCs/>
+                <w:color w:val="FFFFFF"/>
+                <w:sz w:val="20"/>
+                <w:szCs w:val="20"/>
+              </w:rPr>
+              <w:t xml:space="preserve">Ключевые действия</w:t>
+            </w:r>
+          </w:p>
+        </w:tc>
+      </w:tr>
+      <w:tr>
+        <w:tc>
+          <w:tcPr>
+            <w:tcW w:type="dxa" w:w="1000"/>
+            <w:tcMar>
+              <w:top w:type="dxa" w:w="80"/>
+              <w:left w:type="dxa" w:w="100"/>
+              <w:bottom w:type="dxa" w:w="80"/>
+              <w:right w:type="dxa" w:w="100"/>
+            </w:tcMar>
+          </w:tcPr>
+          <w:p>
+            <w:pPr>
+              <w:jc w:val="left"/>
+            </w:pPr>
+            <w:r>
+              <w:rPr>
+                <w:rFonts w:ascii="Calibri" w:cs="Calibri" w:eastAsia="Calibri" w:hAnsi="Calibri"/>
+                <w:b w:val="false"/>
+                <w:bCs w:val="false"/>
+                <w:color w:val="000000"/>
+                <w:sz w:val="20"/>
+                <w:szCs w:val="20"/>
+              </w:rPr>
+              <w:t xml:space="preserve">3</w:t>
+            </w:r>
+          </w:p>
+        </w:tc>
+        <w:tc>
+          <w:tcPr>
+            <w:tcW w:type="dxa" w:w="2000"/>
+            <w:tcMar>
+              <w:top w:type="dxa" w:w="80"/>
+              <w:left w:type="dxa" w:w="100"/>
+              <w:bottom w:type="dxa" w:w="80"/>
+              <w:right w:type="dxa" w:w="100"/>
+            </w:tcMar>
+          </w:tcPr>
+          <w:p>
+            <w:pPr>
+              <w:jc w:val="left"/>
+            </w:pPr>
+            <w:r>
+              <w:rPr>
+                <w:rFonts w:ascii="Calibri" w:cs="Calibri" w:eastAsia="Calibri" w:hAnsi="Calibri"/>
+                <w:b w:val="false"/>
+                <w:bCs w:val="false"/>
+                <w:color w:val="000000"/>
+                <w:sz w:val="20"/>
+                <w:szCs w:val="20"/>
+              </w:rPr>
+              <w:t xml:space="preserve">20</w:t>
+            </w:r>
+          </w:p>
+        </w:tc>
+        <w:tc>
+          <w:tcPr>
+            <w:tcW w:type="dxa" w:w="1900"/>
+            <w:tcMar>
+              <w:top w:type="dxa" w:w="80"/>
+              <w:left w:type="dxa" w:w="100"/>
+              <w:bottom w:type="dxa" w:w="80"/>
+              <w:right w:type="dxa" w:w="100"/>
+            </w:tcMar>
+          </w:tcPr>
+          <w:p>
+            <w:pPr>
+              <w:jc w:val="left"/>
+            </w:pPr>
+            <w:r>
+              <w:rPr>
+                <w:rFonts w:ascii="Calibri" w:cs="Calibri" w:eastAsia="Calibri" w:hAnsi="Calibri"/>
+                <w:b w:val="false"/>
+                <w:bCs w:val="false"/>
+                <w:color w:val="000000"/>
+                <w:sz w:val="20"/>
+                <w:szCs w:val="20"/>
+              </w:rPr>
+              <w:t xml:space="preserve">35</w:t>
+            </w:r>
+          </w:p>
+        </w:tc>
+        <w:tc>
+          <w:tcPr>
+            <w:tcW w:type="dxa" w:w="1700"/>
+            <w:tcMar>
+              <w:top w:type="dxa" w:w="80"/>
+              <w:left w:type="dxa" w:w="100"/>
+              <w:bottom w:type="dxa" w:w="80"/>
+              <w:right w:type="dxa" w:w="100"/>
+            </w:tcMar>
+          </w:tcPr>
+          <w:p>
+            <w:pPr>
+              <w:jc w:val="left"/>
+            </w:pPr>
+            <w:r>
+              <w:rPr>
+                <w:rFonts w:ascii="Calibri" w:cs="Calibri" w:eastAsia="Calibri" w:hAnsi="Calibri"/>
+                <w:b w:val="false"/>
+                <w:bCs w:val="false"/>
+                <w:color w:val="000000"/>
+                <w:sz w:val="20"/>
+                <w:szCs w:val="20"/>
+              </w:rPr>
+              <w:t xml:space="preserve">~$8,000</w:t>
+            </w:r>
+          </w:p>
+        </w:tc>
+        <w:tc>
+          <w:tcPr>
+            <w:tcW w:type="dxa" w:w="3300"/>
+            <w:tcMar>
+              <w:top w:type="dxa" w:w="80"/>
+              <w:left w:type="dxa" w:w="100"/>
+              <w:bottom w:type="dxa" w:w="80"/>
+              <w:right w:type="dxa" w:w="100"/>
+            </w:tcMar>
+          </w:tcPr>
+          <w:p>
+            <w:pPr>
+              <w:jc w:val="left"/>
+            </w:pPr>
+            <w:r>
+              <w:rPr>
+                <w:rFonts w:ascii="Calibri" w:cs="Calibri" w:eastAsia="Calibri" w:hAnsi="Calibri"/>
+                <w:b w:val="false"/>
+                <w:bCs w:val="false"/>
+                <w:color w:val="000000"/>
+                <w:sz w:val="20"/>
+                <w:szCs w:val="20"/>
+              </w:rPr>
+              <w:t xml:space="preserve">Найм SDR, Pro-тариф, Clio marketplace, AU/UK старт</w:t>
+            </w:r>
+          </w:p>
+        </w:tc>
+      </w:tr>
+      <w:tr>
+        <w:tc>
+          <w:tcPr>
+            <w:tcW w:type="dxa" w:w="1000"/>
+            <w:shd w:fill="F2EFE9" w:val="clear"/>
+            <w:tcMar>
+              <w:top w:type="dxa" w:w="80"/>
+              <w:left w:type="dxa" w:w="100"/>
+              <w:bottom w:type="dxa" w:w="80"/>
+              <w:right w:type="dxa" w:w="100"/>
+            </w:tcMar>
+          </w:tcPr>
+          <w:p>
+            <w:pPr>
+              <w:jc w:val="left"/>
+            </w:pPr>
+            <w:r>
+              <w:rPr>
+                <w:rFonts w:ascii="Calibri" w:cs="Calibri" w:eastAsia="Calibri" w:hAnsi="Calibri"/>
+                <w:b w:val="false"/>
+                <w:bCs w:val="false"/>
+                <w:color w:val="000000"/>
+                <w:sz w:val="20"/>
+                <w:szCs w:val="20"/>
+              </w:rPr>
+              <w:t xml:space="preserve">4</w:t>
+            </w:r>
+          </w:p>
+        </w:tc>
+        <w:tc>
+          <w:tcPr>
+            <w:tcW w:type="dxa" w:w="2000"/>
+            <w:shd w:fill="F2EFE9" w:val="clear"/>
+            <w:tcMar>
+              <w:top w:type="dxa" w:w="80"/>
+              <w:left w:type="dxa" w:w="100"/>
+              <w:bottom w:type="dxa" w:w="80"/>
+              <w:right w:type="dxa" w:w="100"/>
+            </w:tcMar>
+          </w:tcPr>
+          <w:p>
+            <w:pPr>
+              <w:jc w:val="left"/>
+            </w:pPr>
+            <w:r>
+              <w:rPr>
+                <w:rFonts w:ascii="Calibri" w:cs="Calibri" w:eastAsia="Calibri" w:hAnsi="Calibri"/>
+                <w:b w:val="false"/>
+                <w:bCs w:val="false"/>
+                <w:color w:val="000000"/>
+                <w:sz w:val="20"/>
+                <w:szCs w:val="20"/>
+              </w:rPr>
+              <w:t xml:space="preserve">35</w:t>
+            </w:r>
+          </w:p>
+        </w:tc>
+        <w:tc>
+          <w:tcPr>
+            <w:tcW w:type="dxa" w:w="1900"/>
+            <w:shd w:fill="F2EFE9" w:val="clear"/>
+            <w:tcMar>
+              <w:top w:type="dxa" w:w="80"/>
+              <w:left w:type="dxa" w:w="100"/>
+              <w:bottom w:type="dxa" w:w="80"/>
+              <w:right w:type="dxa" w:w="100"/>
+            </w:tcMar>
+          </w:tcPr>
+          <w:p>
+            <w:pPr>
+              <w:jc w:val="left"/>
+            </w:pPr>
+            <w:r>
+              <w:rPr>
+                <w:rFonts w:ascii="Calibri" w:cs="Calibri" w:eastAsia="Calibri" w:hAnsi="Calibri"/>
+                <w:b w:val="false"/>
+                <w:bCs w:val="false"/>
+                <w:color w:val="000000"/>
+                <w:sz w:val="20"/>
+                <w:szCs w:val="20"/>
+              </w:rPr>
+              <w:t xml:space="preserve">70</w:t>
+            </w:r>
+          </w:p>
+        </w:tc>
+        <w:tc>
+          <w:tcPr>
+            <w:tcW w:type="dxa" w:w="1700"/>
+            <w:shd w:fill="F2EFE9" w:val="clear"/>
+            <w:tcMar>
+              <w:top w:type="dxa" w:w="80"/>
+              <w:left w:type="dxa" w:w="100"/>
+              <w:bottom w:type="dxa" w:w="80"/>
+              <w:right w:type="dxa" w:w="100"/>
+            </w:tcMar>
+          </w:tcPr>
+          <w:p>
+            <w:pPr>
+              <w:jc w:val="left"/>
+            </w:pPr>
+            <w:r>
+              <w:rPr>
+                <w:rFonts w:ascii="Calibri" w:cs="Calibri" w:eastAsia="Calibri" w:hAnsi="Calibri"/>
+                <w:b w:val="false"/>
+                <w:bCs w:val="false"/>
+                <w:color w:val="000000"/>
+                <w:sz w:val="20"/>
+                <w:szCs w:val="20"/>
+              </w:rPr>
+              <w:t xml:space="preserve">~$18,000</w:t>
+            </w:r>
+          </w:p>
+        </w:tc>
+        <w:tc>
+          <w:tcPr>
+            <w:tcW w:type="dxa" w:w="3300"/>
+            <w:shd w:fill="F2EFE9" w:val="clear"/>
+            <w:tcMar>
+              <w:top w:type="dxa" w:w="80"/>
+              <w:left w:type="dxa" w:w="100"/>
+              <w:bottom w:type="dxa" w:w="80"/>
+              <w:right w:type="dxa" w:w="100"/>
+            </w:tcMar>
+          </w:tcPr>
+          <w:p>
+            <w:pPr>
+              <w:jc w:val="left"/>
+            </w:pPr>
+            <w:r>
+              <w:rPr>
+                <w:rFonts w:ascii="Calibri" w:cs="Calibri" w:eastAsia="Calibri" w:hAnsi="Calibri"/>
+                <w:b w:val="false"/>
+                <w:bCs w:val="false"/>
+                <w:color w:val="000000"/>
+                <w:sz w:val="20"/>
+                <w:szCs w:val="20"/>
+              </w:rPr>
+              <w:t xml:space="preserve">Волна 2, платные каналы (на готовых креативах), реферальная программа</w:t>
+            </w:r>
+          </w:p>
+        </w:tc>
+      </w:tr>
+      <w:tr>
+        <w:tc>
+          <w:tcPr>
+            <w:tcW w:type="dxa" w:w="1000"/>
+            <w:tcMar>
+              <w:top w:type="dxa" w:w="80"/>
+              <w:left w:type="dxa" w:w="100"/>
+              <w:bottom w:type="dxa" w:w="80"/>
+              <w:right w:type="dxa" w:w="100"/>
+            </w:tcMar>
+          </w:tcPr>
+          <w:p>
+            <w:pPr>
+              <w:jc w:val="left"/>
+            </w:pPr>
+            <w:r>
+              <w:rPr>
+                <w:rFonts w:ascii="Calibri" w:cs="Calibri" w:eastAsia="Calibri" w:hAnsi="Calibri"/>
+                <w:b w:val="false"/>
+                <w:bCs w:val="false"/>
+                <w:color w:val="000000"/>
+                <w:sz w:val="20"/>
+                <w:szCs w:val="20"/>
+              </w:rPr>
+              <w:t xml:space="preserve">5</w:t>
+            </w:r>
+          </w:p>
+        </w:tc>
+        <w:tc>
+          <w:tcPr>
+            <w:tcW w:type="dxa" w:w="2000"/>
+            <w:tcMar>
+              <w:top w:type="dxa" w:w="80"/>
+              <w:left w:type="dxa" w:w="100"/>
+              <w:bottom w:type="dxa" w:w="80"/>
+              <w:right w:type="dxa" w:w="100"/>
+            </w:tcMar>
+          </w:tcPr>
+          <w:p>
+            <w:pPr>
+              <w:jc w:val="left"/>
+            </w:pPr>
+            <w:r>
+              <w:rPr>
+                <w:rFonts w:ascii="Calibri" w:cs="Calibri" w:eastAsia="Calibri" w:hAnsi="Calibri"/>
+                <w:b w:val="false"/>
+                <w:bCs w:val="false"/>
+                <w:color w:val="000000"/>
+                <w:sz w:val="20"/>
+                <w:szCs w:val="20"/>
+              </w:rPr>
+              <w:t xml:space="preserve">60</w:t>
+            </w:r>
+          </w:p>
+        </w:tc>
+        <w:tc>
+          <w:tcPr>
+            <w:tcW w:type="dxa" w:w="1900"/>
+            <w:tcMar>
+              <w:top w:type="dxa" w:w="80"/>
+              <w:left w:type="dxa" w:w="100"/>
+              <w:bottom w:type="dxa" w:w="80"/>
+              <w:right w:type="dxa" w:w="100"/>
+            </w:tcMar>
+          </w:tcPr>
+          <w:p>
+            <w:pPr>
+              <w:jc w:val="left"/>
+            </w:pPr>
+            <w:r>
+              <w:rPr>
+                <w:rFonts w:ascii="Calibri" w:cs="Calibri" w:eastAsia="Calibri" w:hAnsi="Calibri"/>
+                <w:b w:val="false"/>
+                <w:bCs w:val="false"/>
+                <w:color w:val="000000"/>
+                <w:sz w:val="20"/>
+                <w:szCs w:val="20"/>
+              </w:rPr>
+              <w:t xml:space="preserve">130</w:t>
+            </w:r>
+          </w:p>
+        </w:tc>
+        <w:tc>
+          <w:tcPr>
+            <w:tcW w:type="dxa" w:w="1700"/>
+            <w:tcMar>
+              <w:top w:type="dxa" w:w="80"/>
+              <w:left w:type="dxa" w:w="100"/>
+              <w:bottom w:type="dxa" w:w="80"/>
+              <w:right w:type="dxa" w:w="100"/>
+            </w:tcMar>
+          </w:tcPr>
+          <w:p>
+            <w:pPr>
+              <w:jc w:val="left"/>
+            </w:pPr>
+            <w:r>
+              <w:rPr>
+                <w:rFonts w:ascii="Calibri" w:cs="Calibri" w:eastAsia="Calibri" w:hAnsi="Calibri"/>
+                <w:b w:val="false"/>
+                <w:bCs w:val="false"/>
+                <w:color w:val="000000"/>
+                <w:sz w:val="20"/>
+                <w:szCs w:val="20"/>
+              </w:rPr>
+              <w:t xml:space="preserve">~$36,000</w:t>
+            </w:r>
+          </w:p>
+        </w:tc>
+        <w:tc>
+          <w:tcPr>
+            <w:tcW w:type="dxa" w:w="3300"/>
+            <w:tcMar>
+              <w:top w:type="dxa" w:w="80"/>
+              <w:left w:type="dxa" w:w="100"/>
+              <w:bottom w:type="dxa" w:w="80"/>
+              <w:right w:type="dxa" w:w="100"/>
+            </w:tcMar>
+          </w:tcPr>
+          <w:p>
+            <w:pPr>
+              <w:jc w:val="left"/>
+            </w:pPr>
+            <w:r>
+              <w:rPr>
+                <w:rFonts w:ascii="Calibri" w:cs="Calibri" w:eastAsia="Calibri" w:hAnsi="Calibri"/>
+                <w:b w:val="false"/>
+                <w:bCs w:val="false"/>
+                <w:color w:val="000000"/>
+                <w:sz w:val="20"/>
+                <w:szCs w:val="20"/>
+              </w:rPr>
+              <w:t xml:space="preserve">Compounding рефералов и партнёрств</w:t>
+            </w:r>
+          </w:p>
+        </w:tc>
+      </w:tr>
+      <w:tr>
+        <w:tc>
+          <w:tcPr>
+            <w:tcW w:type="dxa" w:w="1000"/>
+            <w:shd w:fill="F2EFE9" w:val="clear"/>
+            <w:tcMar>
+              <w:top w:type="dxa" w:w="80"/>
+              <w:left w:type="dxa" w:w="100"/>
+              <w:bottom w:type="dxa" w:w="80"/>
+              <w:right w:type="dxa" w:w="100"/>
+            </w:tcMar>
+          </w:tcPr>
+          <w:p>
+            <w:pPr>
+              <w:jc w:val="left"/>
+            </w:pPr>
+            <w:r>
+              <w:rPr>
+                <w:rFonts w:ascii="Calibri" w:cs="Calibri" w:eastAsia="Calibri" w:hAnsi="Calibri"/>
+                <w:b w:val="false"/>
+                <w:bCs w:val="false"/>
+                <w:color w:val="000000"/>
+                <w:sz w:val="20"/>
+                <w:szCs w:val="20"/>
+              </w:rPr>
+              <w:t xml:space="preserve">6</w:t>
+            </w:r>
+          </w:p>
+        </w:tc>
+        <w:tc>
+          <w:tcPr>
+            <w:tcW w:type="dxa" w:w="2000"/>
+            <w:shd w:fill="F2EFE9" w:val="clear"/>
+            <w:tcMar>
+              <w:top w:type="dxa" w:w="80"/>
+              <w:left w:type="dxa" w:w="100"/>
+              <w:bottom w:type="dxa" w:w="80"/>
+              <w:right w:type="dxa" w:w="100"/>
+            </w:tcMar>
+          </w:tcPr>
+          <w:p>
+            <w:pPr>
+              <w:jc w:val="left"/>
+            </w:pPr>
+            <w:r>
+              <w:rPr>
+                <w:rFonts w:ascii="Calibri" w:cs="Calibri" w:eastAsia="Calibri" w:hAnsi="Calibri"/>
+                <w:b w:val="false"/>
+                <w:bCs w:val="false"/>
+                <w:color w:val="000000"/>
+                <w:sz w:val="20"/>
+                <w:szCs w:val="20"/>
+              </w:rPr>
+              <w:t xml:space="preserve">60</w:t>
+            </w:r>
+          </w:p>
+        </w:tc>
+        <w:tc>
+          <w:tcPr>
+            <w:tcW w:type="dxa" w:w="1900"/>
+            <w:shd w:fill="F2EFE9" w:val="clear"/>
+            <w:tcMar>
+              <w:top w:type="dxa" w:w="80"/>
+              <w:left w:type="dxa" w:w="100"/>
+              <w:bottom w:type="dxa" w:w="80"/>
+              <w:right w:type="dxa" w:w="100"/>
+            </w:tcMar>
+          </w:tcPr>
+          <w:p>
+            <w:pPr>
+              <w:jc w:val="left"/>
+            </w:pPr>
+            <w:r>
+              <w:rPr>
+                <w:rFonts w:ascii="Calibri" w:cs="Calibri" w:eastAsia="Calibri" w:hAnsi="Calibri"/>
+                <w:b w:val="false"/>
+                <w:bCs w:val="false"/>
+                <w:color w:val="000000"/>
+                <w:sz w:val="20"/>
+                <w:szCs w:val="20"/>
+              </w:rPr>
+              <w:t xml:space="preserve">190</w:t>
+            </w:r>
+          </w:p>
+        </w:tc>
+        <w:tc>
+          <w:tcPr>
+            <w:tcW w:type="dxa" w:w="1700"/>
+            <w:shd w:fill="F2EFE9" w:val="clear"/>
+            <w:tcMar>
+              <w:top w:type="dxa" w:w="80"/>
+              <w:left w:type="dxa" w:w="100"/>
+              <w:bottom w:type="dxa" w:w="80"/>
+              <w:right w:type="dxa" w:w="100"/>
+            </w:tcMar>
+          </w:tcPr>
+          <w:p>
+            <w:pPr>
+              <w:jc w:val="left"/>
+            </w:pPr>
+            <w:r>
+              <w:rPr>
+                <w:rFonts w:ascii="Calibri" w:cs="Calibri" w:eastAsia="Calibri" w:hAnsi="Calibri"/>
+                <w:b w:val="false"/>
+                <w:bCs w:val="false"/>
+                <w:color w:val="000000"/>
+                <w:sz w:val="20"/>
+                <w:szCs w:val="20"/>
+              </w:rPr>
+              <w:t xml:space="preserve">~$50,000</w:t>
+            </w:r>
+          </w:p>
+        </w:tc>
+        <w:tc>
+          <w:tcPr>
+            <w:tcW w:type="dxa" w:w="3300"/>
+            <w:shd w:fill="F2EFE9" w:val="clear"/>
+            <w:tcMar>
+              <w:top w:type="dxa" w:w="80"/>
+              <w:left w:type="dxa" w:w="100"/>
+              <w:bottom w:type="dxa" w:w="80"/>
+              <w:right w:type="dxa" w:w="100"/>
+            </w:tcMar>
+          </w:tcPr>
+          <w:p>
+            <w:pPr>
+              <w:jc w:val="left"/>
+            </w:pPr>
+            <w:r>
+              <w:rPr>
+                <w:rFonts w:ascii="Calibri" w:cs="Calibri" w:eastAsia="Calibri" w:hAnsi="Calibri"/>
+                <w:b w:val="false"/>
+                <w:bCs w:val="false"/>
+                <w:color w:val="000000"/>
+                <w:sz w:val="20"/>
+                <w:szCs w:val="20"/>
+              </w:rPr>
+              <w:t xml:space="preserve">Целевая конфигурация раздела 2 достигнута</w:t>
+            </w:r>
+          </w:p>
+        </w:tc>
+      </w:tr>
+    </w:tbl>
+    <w:p>
+      <w:pPr>
+        <w:spacing w:after="200" w:before="100"/>
+      </w:pPr>
+      <w:r>
+        <w:rPr>
+          <w:rFonts w:ascii="Calibri" w:cs="Calibri" w:eastAsia="Calibri" w:hAnsi="Calibri"/>
+          <w:i/>
+          <w:iCs/>
+          <w:color w:val="6B6B6B"/>
+          <w:sz w:val="20"/>
+          <w:szCs w:val="20"/>
+        </w:rPr>
+        <w:t xml:space="preserve">Рост мес. 3→6 предполагает, что найм и платные каналы запущены вовремя по итогам точки решения — это целевой темп, не гарантированный.</w:t>
+      </w:r>
+    </w:p>
+    <w:p>
+      <w:pPr>
+        <w:pStyle w:val="Heading2"/>
+        <w:spacing w:after="150" w:before="300"/>
+      </w:pPr>
+      <w:r>
+        <w:rPr>
+          <w:rFonts w:ascii="Calibri" w:cs="Calibri" w:eastAsia="Calibri" w:hAnsi="Calibri"/>
+          <w:b/>
+          <w:bCs/>
+          <w:color w:val="1F3A5F"/>
+          <w:sz w:val="24"/>
+          <w:szCs w:val="24"/>
+        </w:rPr>
+        <w:t xml:space="preserve">Консервативная ветка (мес. 3–6, если критерии не выполнены)</w:t>
+      </w:r>
+    </w:p>
+    <w:tbl>
+      <w:tblPr>
+        <w:tblW w:type="dxa" w:w="9900"/>
+        <w:tblBorders>
+          <w:top w:val="single" w:color="CCCCCC" w:sz="4"/>
+          <w:left w:val="single" w:color="CCCCCC" w:sz="4"/>
+          <w:bottom w:val="single" w:color="CCCCCC" w:sz="4"/>
+          <w:right w:val="single" w:color="CCCCCC" w:sz="4"/>
+          <w:insideH w:val="single" w:color="E0E0E0" w:sz="4"/>
+          <w:insideV w:val="single" w:color="E0E0E0" w:sz="4"/>
+        </w:tblBorders>
+      </w:tblPr>
+      <w:tblGrid>
+        <w:gridCol w:w="1000"/>
+        <w:gridCol w:w="2000"/>
+        <w:gridCol w:w="1900"/>
+        <w:gridCol w:w="1700"/>
+        <w:gridCol w:w="3300"/>
+      </w:tblGrid>
+      <w:tr>
+        <w:trPr>
+          <w:tblHeader/>
+        </w:trPr>
+        <w:tc>
+          <w:tcPr>
+            <w:tcW w:type="dxa" w:w="1000"/>
+            <w:shd w:fill="1F3A5F" w:val="clear"/>
+            <w:tcMar>
+              <w:top w:type="dxa" w:w="80"/>
+              <w:left w:type="dxa" w:w="100"/>
+              <w:bottom w:type="dxa" w:w="80"/>
+              <w:right w:type="dxa" w:w="100"/>
+            </w:tcMar>
+          </w:tcPr>
+          <w:p>
+            <w:pPr>
+              <w:jc w:val="left"/>
+            </w:pPr>
+            <w:r>
+              <w:rPr>
+                <w:rFonts w:ascii="Calibri" w:cs="Calibri" w:eastAsia="Calibri" w:hAnsi="Calibri"/>
+                <w:b/>
+                <w:bCs/>
+                <w:color w:val="FFFFFF"/>
+                <w:sz w:val="20"/>
+                <w:szCs w:val="20"/>
+              </w:rPr>
+              <w:t xml:space="preserve">Месяц</w:t>
+            </w:r>
+          </w:p>
+        </w:tc>
+        <w:tc>
+          <w:tcPr>
+            <w:tcW w:type="dxa" w:w="2000"/>
+            <w:shd w:fill="1F3A5F" w:val="clear"/>
+            <w:tcMar>
+              <w:top w:type="dxa" w:w="80"/>
+              <w:left w:type="dxa" w:w="100"/>
+              <w:bottom w:type="dxa" w:w="80"/>
+              <w:right w:type="dxa" w:w="100"/>
+            </w:tcMar>
+          </w:tcPr>
+          <w:p>
+            <w:pPr>
+              <w:jc w:val="left"/>
+            </w:pPr>
+            <w:r>
+              <w:rPr>
+                <w:rFonts w:ascii="Calibri" w:cs="Calibri" w:eastAsia="Calibri" w:hAnsi="Calibri"/>
+                <w:b/>
+                <w:bCs/>
+                <w:color w:val="FFFFFF"/>
+                <w:sz w:val="20"/>
+                <w:szCs w:val="20"/>
+              </w:rPr>
+              <w:t xml:space="preserve">Новых клиентов</w:t>
+            </w:r>
+          </w:p>
+        </w:tc>
+        <w:tc>
+          <w:tcPr>
+            <w:tcW w:type="dxa" w:w="1900"/>
+            <w:shd w:fill="1F3A5F" w:val="clear"/>
+            <w:tcMar>
+              <w:top w:type="dxa" w:w="80"/>
+              <w:left w:type="dxa" w:w="100"/>
+              <w:bottom w:type="dxa" w:w="80"/>
+              <w:right w:type="dxa" w:w="100"/>
+            </w:tcMar>
+          </w:tcPr>
+          <w:p>
+            <w:pPr>
+              <w:jc w:val="left"/>
+            </w:pPr>
+            <w:r>
+              <w:rPr>
+                <w:rFonts w:ascii="Calibri" w:cs="Calibri" w:eastAsia="Calibri" w:hAnsi="Calibri"/>
+                <w:b/>
+                <w:bCs/>
+                <w:color w:val="FFFFFF"/>
+                <w:sz w:val="20"/>
+                <w:szCs w:val="20"/>
+              </w:rPr>
+              <w:t xml:space="preserve">Всего клиентов</w:t>
+            </w:r>
+          </w:p>
+        </w:tc>
+        <w:tc>
+          <w:tcPr>
+            <w:tcW w:type="dxa" w:w="1700"/>
+            <w:shd w:fill="1F3A5F" w:val="clear"/>
+            <w:tcMar>
+              <w:top w:type="dxa" w:w="80"/>
+              <w:left w:type="dxa" w:w="100"/>
+              <w:bottom w:type="dxa" w:w="80"/>
+              <w:right w:type="dxa" w:w="100"/>
+            </w:tcMar>
+          </w:tcPr>
+          <w:p>
+            <w:pPr>
+              <w:jc w:val="left"/>
+            </w:pPr>
+            <w:r>
+              <w:rPr>
+                <w:rFonts w:ascii="Calibri" w:cs="Calibri" w:eastAsia="Calibri" w:hAnsi="Calibri"/>
+                <w:b/>
+                <w:bCs/>
+                <w:color w:val="FFFFFF"/>
+                <w:sz w:val="20"/>
+                <w:szCs w:val="20"/>
+              </w:rPr>
+              <w:t xml:space="preserve">MRR</w:t>
+            </w:r>
+          </w:p>
+        </w:tc>
+        <w:tc>
+          <w:tcPr>
+            <w:tcW w:type="dxa" w:w="3300"/>
+            <w:shd w:fill="1F3A5F" w:val="clear"/>
+            <w:tcMar>
+              <w:top w:type="dxa" w:w="80"/>
+              <w:left w:type="dxa" w:w="100"/>
+              <w:bottom w:type="dxa" w:w="80"/>
+              <w:right w:type="dxa" w:w="100"/>
+            </w:tcMar>
+          </w:tcPr>
+          <w:p>
+            <w:pPr>
+              <w:jc w:val="left"/>
+            </w:pPr>
+            <w:r>
+              <w:rPr>
+                <w:rFonts w:ascii="Calibri" w:cs="Calibri" w:eastAsia="Calibri" w:hAnsi="Calibri"/>
+                <w:b/>
+                <w:bCs/>
+                <w:color w:val="FFFFFF"/>
+                <w:sz w:val="20"/>
+                <w:szCs w:val="20"/>
+              </w:rPr>
+              <w:t xml:space="preserve">Ключевые действия</w:t>
+            </w:r>
+          </w:p>
+        </w:tc>
+      </w:tr>
+      <w:tr>
+        <w:tc>
+          <w:tcPr>
+            <w:tcW w:type="dxa" w:w="1000"/>
+            <w:tcMar>
+              <w:top w:type="dxa" w:w="80"/>
+              <w:left w:type="dxa" w:w="100"/>
+              <w:bottom w:type="dxa" w:w="80"/>
+              <w:right w:type="dxa" w:w="100"/>
+            </w:tcMar>
+          </w:tcPr>
+          <w:p>
+            <w:pPr>
+              <w:jc w:val="left"/>
+            </w:pPr>
+            <w:r>
+              <w:rPr>
+                <w:rFonts w:ascii="Calibri" w:cs="Calibri" w:eastAsia="Calibri" w:hAnsi="Calibri"/>
+                <w:b w:val="false"/>
+                <w:bCs w:val="false"/>
+                <w:color w:val="000000"/>
+                <w:sz w:val="20"/>
+                <w:szCs w:val="20"/>
+              </w:rPr>
+              <w:t xml:space="preserve">3</w:t>
+            </w:r>
+          </w:p>
+        </w:tc>
+        <w:tc>
+          <w:tcPr>
+            <w:tcW w:type="dxa" w:w="2000"/>
+            <w:tcMar>
+              <w:top w:type="dxa" w:w="80"/>
+              <w:left w:type="dxa" w:w="100"/>
+              <w:bottom w:type="dxa" w:w="80"/>
+              <w:right w:type="dxa" w:w="100"/>
+            </w:tcMar>
+          </w:tcPr>
+          <w:p>
+            <w:pPr>
+              <w:jc w:val="left"/>
+            </w:pPr>
+            <w:r>
+              <w:rPr>
+                <w:rFonts w:ascii="Calibri" w:cs="Calibri" w:eastAsia="Calibri" w:hAnsi="Calibri"/>
+                <w:b w:val="false"/>
+                <w:bCs w:val="false"/>
+                <w:color w:val="000000"/>
+                <w:sz w:val="20"/>
+                <w:szCs w:val="20"/>
+              </w:rPr>
+              <w:t xml:space="preserve">8</w:t>
+            </w:r>
+          </w:p>
+        </w:tc>
+        <w:tc>
+          <w:tcPr>
+            <w:tcW w:type="dxa" w:w="1900"/>
+            <w:tcMar>
+              <w:top w:type="dxa" w:w="80"/>
+              <w:left w:type="dxa" w:w="100"/>
+              <w:bottom w:type="dxa" w:w="80"/>
+              <w:right w:type="dxa" w:w="100"/>
+            </w:tcMar>
+          </w:tcPr>
+          <w:p>
+            <w:pPr>
+              <w:jc w:val="left"/>
+            </w:pPr>
+            <w:r>
+              <w:rPr>
+                <w:rFonts w:ascii="Calibri" w:cs="Calibri" w:eastAsia="Calibri" w:hAnsi="Calibri"/>
+                <w:b w:val="false"/>
+                <w:bCs w:val="false"/>
+                <w:color w:val="000000"/>
+                <w:sz w:val="20"/>
+                <w:szCs w:val="20"/>
+              </w:rPr>
+              <w:t xml:space="preserve">23</w:t>
+            </w:r>
+          </w:p>
+        </w:tc>
+        <w:tc>
+          <w:tcPr>
+            <w:tcW w:type="dxa" w:w="1700"/>
+            <w:tcMar>
+              <w:top w:type="dxa" w:w="80"/>
+              <w:left w:type="dxa" w:w="100"/>
+              <w:bottom w:type="dxa" w:w="80"/>
+              <w:right w:type="dxa" w:w="100"/>
+            </w:tcMar>
+          </w:tcPr>
+          <w:p>
+            <w:pPr>
+              <w:jc w:val="left"/>
+            </w:pPr>
+            <w:r>
+              <w:rPr>
+                <w:rFonts w:ascii="Calibri" w:cs="Calibri" w:eastAsia="Calibri" w:hAnsi="Calibri"/>
+                <w:b w:val="false"/>
+                <w:bCs w:val="false"/>
+                <w:color w:val="000000"/>
+                <w:sz w:val="20"/>
+                <w:szCs w:val="20"/>
+              </w:rPr>
+              <w:t xml:space="preserve">~$4,600</w:t>
+            </w:r>
+          </w:p>
+        </w:tc>
+        <w:tc>
+          <w:tcPr>
+            <w:tcW w:type="dxa" w:w="3300"/>
+            <w:tcMar>
+              <w:top w:type="dxa" w:w="80"/>
+              <w:left w:type="dxa" w:w="100"/>
+              <w:bottom w:type="dxa" w:w="80"/>
+              <w:right w:type="dxa" w:w="100"/>
+            </w:tcMar>
+          </w:tcPr>
+          <w:p>
+            <w:pPr>
+              <w:jc w:val="left"/>
+            </w:pPr>
+            <w:r>
+              <w:rPr>
+                <w:rFonts w:ascii="Calibri" w:cs="Calibri" w:eastAsia="Calibri" w:hAnsi="Calibri"/>
+                <w:b w:val="false"/>
+                <w:bCs w:val="false"/>
+                <w:color w:val="000000"/>
+                <w:sz w:val="20"/>
+                <w:szCs w:val="20"/>
+              </w:rPr>
+              <w:t xml:space="preserve">Только личный outbound, Pro-тариф при готовности</w:t>
+            </w:r>
+          </w:p>
+        </w:tc>
+      </w:tr>
+      <w:tr>
+        <w:tc>
+          <w:tcPr>
+            <w:tcW w:type="dxa" w:w="1000"/>
+            <w:shd w:fill="F2EFE9" w:val="clear"/>
+            <w:tcMar>
+              <w:top w:type="dxa" w:w="80"/>
+              <w:left w:type="dxa" w:w="100"/>
+              <w:bottom w:type="dxa" w:w="80"/>
+              <w:right w:type="dxa" w:w="100"/>
+            </w:tcMar>
+          </w:tcPr>
+          <w:p>
+            <w:pPr>
+              <w:jc w:val="left"/>
+            </w:pPr>
+            <w:r>
+              <w:rPr>
+                <w:rFonts w:ascii="Calibri" w:cs="Calibri" w:eastAsia="Calibri" w:hAnsi="Calibri"/>
+                <w:b w:val="false"/>
+                <w:bCs w:val="false"/>
+                <w:color w:val="000000"/>
+                <w:sz w:val="20"/>
+                <w:szCs w:val="20"/>
+              </w:rPr>
+              <w:t xml:space="preserve">4</w:t>
+            </w:r>
+          </w:p>
+        </w:tc>
+        <w:tc>
+          <w:tcPr>
+            <w:tcW w:type="dxa" w:w="2000"/>
+            <w:shd w:fill="F2EFE9" w:val="clear"/>
+            <w:tcMar>
+              <w:top w:type="dxa" w:w="80"/>
+              <w:left w:type="dxa" w:w="100"/>
+              <w:bottom w:type="dxa" w:w="80"/>
+              <w:right w:type="dxa" w:w="100"/>
+            </w:tcMar>
+          </w:tcPr>
+          <w:p>
+            <w:pPr>
+              <w:jc w:val="left"/>
+            </w:pPr>
+            <w:r>
+              <w:rPr>
+                <w:rFonts w:ascii="Calibri" w:cs="Calibri" w:eastAsia="Calibri" w:hAnsi="Calibri"/>
+                <w:b w:val="false"/>
+                <w:bCs w:val="false"/>
+                <w:color w:val="000000"/>
+                <w:sz w:val="20"/>
+                <w:szCs w:val="20"/>
+              </w:rPr>
+              <w:t xml:space="preserve">10</w:t>
+            </w:r>
+          </w:p>
+        </w:tc>
+        <w:tc>
+          <w:tcPr>
+            <w:tcW w:type="dxa" w:w="1900"/>
+            <w:shd w:fill="F2EFE9" w:val="clear"/>
+            <w:tcMar>
+              <w:top w:type="dxa" w:w="80"/>
+              <w:left w:type="dxa" w:w="100"/>
+              <w:bottom w:type="dxa" w:w="80"/>
+              <w:right w:type="dxa" w:w="100"/>
+            </w:tcMar>
+          </w:tcPr>
+          <w:p>
+            <w:pPr>
+              <w:jc w:val="left"/>
+            </w:pPr>
+            <w:r>
+              <w:rPr>
+                <w:rFonts w:ascii="Calibri" w:cs="Calibri" w:eastAsia="Calibri" w:hAnsi="Calibri"/>
+                <w:b w:val="false"/>
+                <w:bCs w:val="false"/>
+                <w:color w:val="000000"/>
+                <w:sz w:val="20"/>
+                <w:szCs w:val="20"/>
+              </w:rPr>
+              <w:t xml:space="preserve">33</w:t>
+            </w:r>
+          </w:p>
+        </w:tc>
+        <w:tc>
+          <w:tcPr>
+            <w:tcW w:type="dxa" w:w="1700"/>
+            <w:shd w:fill="F2EFE9" w:val="clear"/>
+            <w:tcMar>
+              <w:top w:type="dxa" w:w="80"/>
+              <w:left w:type="dxa" w:w="100"/>
+              <w:bottom w:type="dxa" w:w="80"/>
+              <w:right w:type="dxa" w:w="100"/>
+            </w:tcMar>
+          </w:tcPr>
+          <w:p>
+            <w:pPr>
+              <w:jc w:val="left"/>
+            </w:pPr>
+            <w:r>
+              <w:rPr>
+                <w:rFonts w:ascii="Calibri" w:cs="Calibri" w:eastAsia="Calibri" w:hAnsi="Calibri"/>
+                <w:b w:val="false"/>
+                <w:bCs w:val="false"/>
+                <w:color w:val="000000"/>
+                <w:sz w:val="20"/>
+                <w:szCs w:val="20"/>
+              </w:rPr>
+              <w:t xml:space="preserve">~$6,600</w:t>
+            </w:r>
+          </w:p>
+        </w:tc>
+        <w:tc>
+          <w:tcPr>
+            <w:tcW w:type="dxa" w:w="3300"/>
+            <w:shd w:fill="F2EFE9" w:val="clear"/>
+            <w:tcMar>
+              <w:top w:type="dxa" w:w="80"/>
+              <w:left w:type="dxa" w:w="100"/>
+              <w:bottom w:type="dxa" w:w="80"/>
+              <w:right w:type="dxa" w:w="100"/>
+            </w:tcMar>
+          </w:tcPr>
+          <w:p>
+            <w:pPr>
+              <w:jc w:val="left"/>
+            </w:pPr>
+            <w:r>
+              <w:rPr>
+                <w:rFonts w:ascii="Calibri" w:cs="Calibri" w:eastAsia="Calibri" w:hAnsi="Calibri"/>
+                <w:b w:val="false"/>
+                <w:bCs w:val="false"/>
+                <w:color w:val="000000"/>
+                <w:sz w:val="20"/>
+                <w:szCs w:val="20"/>
+              </w:rPr>
+              <w:t xml:space="preserve">Повторная точка решения о найме/бюджете</w:t>
+            </w:r>
+          </w:p>
+        </w:tc>
+      </w:tr>
+      <w:tr>
+        <w:tc>
+          <w:tcPr>
+            <w:tcW w:type="dxa" w:w="1000"/>
+            <w:tcMar>
+              <w:top w:type="dxa" w:w="80"/>
+              <w:left w:type="dxa" w:w="100"/>
+              <w:bottom w:type="dxa" w:w="80"/>
+              <w:right w:type="dxa" w:w="100"/>
+            </w:tcMar>
+          </w:tcPr>
+          <w:p>
+            <w:pPr>
+              <w:jc w:val="left"/>
+            </w:pPr>
+            <w:r>
+              <w:rPr>
+                <w:rFonts w:ascii="Calibri" w:cs="Calibri" w:eastAsia="Calibri" w:hAnsi="Calibri"/>
+                <w:b w:val="false"/>
+                <w:bCs w:val="false"/>
+                <w:color w:val="000000"/>
+                <w:sz w:val="20"/>
+                <w:szCs w:val="20"/>
+              </w:rPr>
+              <w:t xml:space="preserve">5</w:t>
+            </w:r>
+          </w:p>
+        </w:tc>
+        <w:tc>
+          <w:tcPr>
+            <w:tcW w:type="dxa" w:w="2000"/>
+            <w:tcMar>
+              <w:top w:type="dxa" w:w="80"/>
+              <w:left w:type="dxa" w:w="100"/>
+              <w:bottom w:type="dxa" w:w="80"/>
+              <w:right w:type="dxa" w:w="100"/>
+            </w:tcMar>
+          </w:tcPr>
+          <w:p>
+            <w:pPr>
+              <w:jc w:val="left"/>
+            </w:pPr>
+            <w:r>
+              <w:rPr>
+                <w:rFonts w:ascii="Calibri" w:cs="Calibri" w:eastAsia="Calibri" w:hAnsi="Calibri"/>
+                <w:b w:val="false"/>
+                <w:bCs w:val="false"/>
+                <w:color w:val="000000"/>
+                <w:sz w:val="20"/>
+                <w:szCs w:val="20"/>
+              </w:rPr>
+              <w:t xml:space="preserve">12</w:t>
+            </w:r>
+          </w:p>
+        </w:tc>
+        <w:tc>
+          <w:tcPr>
+            <w:tcW w:type="dxa" w:w="1900"/>
+            <w:tcMar>
+              <w:top w:type="dxa" w:w="80"/>
+              <w:left w:type="dxa" w:w="100"/>
+              <w:bottom w:type="dxa" w:w="80"/>
+              <w:right w:type="dxa" w:w="100"/>
+            </w:tcMar>
+          </w:tcPr>
+          <w:p>
+            <w:pPr>
+              <w:jc w:val="left"/>
+            </w:pPr>
+            <w:r>
+              <w:rPr>
+                <w:rFonts w:ascii="Calibri" w:cs="Calibri" w:eastAsia="Calibri" w:hAnsi="Calibri"/>
+                <w:b w:val="false"/>
+                <w:bCs w:val="false"/>
+                <w:color w:val="000000"/>
+                <w:sz w:val="20"/>
+                <w:szCs w:val="20"/>
+              </w:rPr>
+              <w:t xml:space="preserve">45</w:t>
+            </w:r>
+          </w:p>
+        </w:tc>
+        <w:tc>
+          <w:tcPr>
+            <w:tcW w:type="dxa" w:w="1700"/>
+            <w:tcMar>
+              <w:top w:type="dxa" w:w="80"/>
+              <w:left w:type="dxa" w:w="100"/>
+              <w:bottom w:type="dxa" w:w="80"/>
+              <w:right w:type="dxa" w:w="100"/>
+            </w:tcMar>
+          </w:tcPr>
+          <w:p>
+            <w:pPr>
+              <w:jc w:val="left"/>
+            </w:pPr>
+            <w:r>
+              <w:rPr>
+                <w:rFonts w:ascii="Calibri" w:cs="Calibri" w:eastAsia="Calibri" w:hAnsi="Calibri"/>
+                <w:b w:val="false"/>
+                <w:bCs w:val="false"/>
+                <w:color w:val="000000"/>
+                <w:sz w:val="20"/>
+                <w:szCs w:val="20"/>
+              </w:rPr>
+              <w:t xml:space="preserve">~$9,000</w:t>
+            </w:r>
+          </w:p>
+        </w:tc>
+        <w:tc>
+          <w:tcPr>
+            <w:tcW w:type="dxa" w:w="3300"/>
+            <w:tcMar>
+              <w:top w:type="dxa" w:w="80"/>
+              <w:left w:type="dxa" w:w="100"/>
+              <w:bottom w:type="dxa" w:w="80"/>
+              <w:right w:type="dxa" w:w="100"/>
+            </w:tcMar>
+          </w:tcPr>
+          <w:p>
+            <w:pPr>
+              <w:jc w:val="left"/>
+            </w:pPr>
+            <w:r>
+              <w:rPr>
+                <w:rFonts w:ascii="Calibri" w:cs="Calibri" w:eastAsia="Calibri" w:hAnsi="Calibri"/>
+                <w:b w:val="false"/>
+                <w:bCs w:val="false"/>
+                <w:color w:val="000000"/>
+                <w:sz w:val="20"/>
+                <w:szCs w:val="20"/>
+              </w:rPr>
+              <w:t xml:space="preserve">Личный outbound + первые органические рефералы</w:t>
+            </w:r>
+          </w:p>
+        </w:tc>
+      </w:tr>
+      <w:tr>
+        <w:tc>
+          <w:tcPr>
+            <w:tcW w:type="dxa" w:w="1000"/>
+            <w:shd w:fill="F2EFE9" w:val="clear"/>
+            <w:tcMar>
+              <w:top w:type="dxa" w:w="80"/>
+              <w:left w:type="dxa" w:w="100"/>
+              <w:bottom w:type="dxa" w:w="80"/>
+              <w:right w:type="dxa" w:w="100"/>
+            </w:tcMar>
+          </w:tcPr>
+          <w:p>
+            <w:pPr>
+              <w:jc w:val="left"/>
+            </w:pPr>
+            <w:r>
+              <w:rPr>
+                <w:rFonts w:ascii="Calibri" w:cs="Calibri" w:eastAsia="Calibri" w:hAnsi="Calibri"/>
+                <w:b w:val="false"/>
+                <w:bCs w:val="false"/>
+                <w:color w:val="000000"/>
+                <w:sz w:val="20"/>
+                <w:szCs w:val="20"/>
+              </w:rPr>
+              <w:t xml:space="preserve">6</w:t>
+            </w:r>
+          </w:p>
+        </w:tc>
+        <w:tc>
+          <w:tcPr>
+            <w:tcW w:type="dxa" w:w="2000"/>
+            <w:shd w:fill="F2EFE9" w:val="clear"/>
+            <w:tcMar>
+              <w:top w:type="dxa" w:w="80"/>
+              <w:left w:type="dxa" w:w="100"/>
+              <w:bottom w:type="dxa" w:w="80"/>
+              <w:right w:type="dxa" w:w="100"/>
+            </w:tcMar>
+          </w:tcPr>
+          <w:p>
+            <w:pPr>
+              <w:jc w:val="left"/>
+            </w:pPr>
+            <w:r>
+              <w:rPr>
+                <w:rFonts w:ascii="Calibri" w:cs="Calibri" w:eastAsia="Calibri" w:hAnsi="Calibri"/>
+                <w:b w:val="false"/>
+                <w:bCs w:val="false"/>
+                <w:color w:val="000000"/>
+                <w:sz w:val="20"/>
+                <w:szCs w:val="20"/>
+              </w:rPr>
+              <w:t xml:space="preserve">15</w:t>
+            </w:r>
+          </w:p>
+        </w:tc>
+        <w:tc>
+          <w:tcPr>
+            <w:tcW w:type="dxa" w:w="1900"/>
+            <w:shd w:fill="F2EFE9" w:val="clear"/>
+            <w:tcMar>
+              <w:top w:type="dxa" w:w="80"/>
+              <w:left w:type="dxa" w:w="100"/>
+              <w:bottom w:type="dxa" w:w="80"/>
+              <w:right w:type="dxa" w:w="100"/>
+            </w:tcMar>
+          </w:tcPr>
+          <w:p>
+            <w:pPr>
+              <w:jc w:val="left"/>
+            </w:pPr>
+            <w:r>
+              <w:rPr>
+                <w:rFonts w:ascii="Calibri" w:cs="Calibri" w:eastAsia="Calibri" w:hAnsi="Calibri"/>
+                <w:b w:val="false"/>
+                <w:bCs w:val="false"/>
+                <w:color w:val="000000"/>
+                <w:sz w:val="20"/>
+                <w:szCs w:val="20"/>
+              </w:rPr>
+              <w:t xml:space="preserve">60</w:t>
+            </w:r>
+          </w:p>
+        </w:tc>
+        <w:tc>
+          <w:tcPr>
+            <w:tcW w:type="dxa" w:w="1700"/>
+            <w:shd w:fill="F2EFE9" w:val="clear"/>
+            <w:tcMar>
+              <w:top w:type="dxa" w:w="80"/>
+              <w:left w:type="dxa" w:w="100"/>
+              <w:bottom w:type="dxa" w:w="80"/>
+              <w:right w:type="dxa" w:w="100"/>
+            </w:tcMar>
+          </w:tcPr>
+          <w:p>
+            <w:pPr>
+              <w:jc w:val="left"/>
+            </w:pPr>
+            <w:r>
+              <w:rPr>
+                <w:rFonts w:ascii="Calibri" w:cs="Calibri" w:eastAsia="Calibri" w:hAnsi="Calibri"/>
+                <w:b w:val="false"/>
+                <w:bCs w:val="false"/>
+                <w:color w:val="000000"/>
+                <w:sz w:val="20"/>
+                <w:szCs w:val="20"/>
+              </w:rPr>
+              <w:t xml:space="preserve">~$12,000</w:t>
+            </w:r>
+          </w:p>
+        </w:tc>
+        <w:tc>
+          <w:tcPr>
+            <w:tcW w:type="dxa" w:w="3300"/>
+            <w:shd w:fill="F2EFE9" w:val="clear"/>
+            <w:tcMar>
+              <w:top w:type="dxa" w:w="80"/>
+              <w:left w:type="dxa" w:w="100"/>
+              <w:bottom w:type="dxa" w:w="80"/>
+              <w:right w:type="dxa" w:w="100"/>
+            </w:tcMar>
+          </w:tcPr>
+          <w:p>
+            <w:pPr>
+              <w:jc w:val="left"/>
+            </w:pPr>
+            <w:r>
+              <w:rPr>
+                <w:rFonts w:ascii="Calibri" w:cs="Calibri" w:eastAsia="Calibri" w:hAnsi="Calibri"/>
+                <w:b w:val="false"/>
+                <w:bCs w:val="false"/>
+                <w:color w:val="000000"/>
+                <w:sz w:val="20"/>
+                <w:szCs w:val="20"/>
+              </w:rPr>
+              <w:t xml:space="preserve">Реалистичный потолок без найма/бюджета</w:t>
+            </w:r>
+          </w:p>
+        </w:tc>
+      </w:tr>
+    </w:tbl>
+    <w:p>
+      <w:pPr>
+        <w:spacing w:after="200" w:before="100"/>
+      </w:pPr>
+      <w:r>
+        <w:rPr>
+          <w:rFonts w:ascii="Calibri" w:cs="Calibri" w:eastAsia="Calibri" w:hAnsi="Calibri"/>
+          <w:i/>
+          <w:iCs/>
+          <w:color w:val="6B6B6B"/>
+          <w:sz w:val="20"/>
+          <w:szCs w:val="20"/>
+        </w:rPr>
+        <w:t xml:space="preserve">Консервативная ветка приземляется в диапазон $10–15K MRR, обозначенный в разделе 9 как честный потолок founder-led outbound без найма и платных каналов — не провал плана, а его сознательно выбранная нижняя граница на старте.</w:t>
       </w:r>
     </w:p>
     <w:p>
@@ -3888,7 +5288,7 @@
           <w:sz w:val="22"/>
           <w:szCs w:val="22"/>
         </w:rPr>
-        <w:t xml:space="preserve">Throughput одного основателя — жёсткий потолок агрессивного сценария. Если найм SDR/BDR не состоится к мес. 2–3 или платный бюджет не появится к мес. 3–4, реалистичный результат 6 месяцев — $10–15K MRR (60–75 клиентов) на одном outbound-канале в юридической нише, а не $50K. Это не провал плана, а его консервативная нижняя граница — стоит явно решить заранее, какой из двух сценариев планируется финансировать.</w:t>
+        <w:t xml:space="preserve">Throughput одного основателя — жёсткий потолок консервативной ветки (раздел 8) по решению. Если точка принятия решения в конце мес. 2 не подтвердит критерии и найм/бюджет не будут запущены, реалистичный результат 6 месяцев — $10–15K MRR (60–75 клиентов) на одном outbound-канале, а не $50K. Это осознанно выбранный гибридный путь, а не провал плана — риск в том, чтобы не тянуть с повторной точкой решения в мес. 4, если метрики к тому моменту уже выглядят убедительно.</w:t>
       </w:r>
     </w:p>
     <w:p>

</xml_diff>